<commit_message>
Add pixel-fitted header lockups; detailed symbol at all sizes (v1.2)
The master lockup looked cramped in headers: shrunk to ~20px the tight
tracking closed up the letters and the 2px stroke fell between pixel rows.
New resale-lockup-header-{28..44}(-dark) files are drawn at exact pixel
heights with small-size optical adjustments (looser tracking, .com.pk in
Inter 600 at 72%, baseline/stroke/fold snapped to whole pixels) plus
1x/2x/3x PNGs. The lockup keeps the full-gradient symbol on every size,
including mobile. Guidelines, brand page and handoff kit updated to v1.2.

Co-Authored-By: Claude Opus 5.5 <noreply@anthropic.com>
</commit_message>
<xml_diff>
--- a/resale-brand-ui-guidelines-v1.docx
+++ b/resale-brand-ui-guidelines-v1.docx
@@ -75,7 +75,7 @@
           <w:sz w:val="22"/>
           <w:szCs w:val="22"/>
         </w:rPr>
-        <w:t xml:space="preserve">Version 1.1 (1 October 2026)</w:t>
+        <w:t xml:space="preserve">Version 1.2 (3 October 2026)</w:t>
       </w:r>
     </w:p>
     <w:p>
@@ -1862,7 +1862,7 @@
                 <w:sz w:val="19"/>
                 <w:szCs w:val="19"/>
               </w:rPr>
-              <w:t xml:space="preserve">Horizontal, small</w:t>
+              <w:t xml:space="preserve">Header (pixel-fitted)</w:t>
             </w:r>
           </w:p>
         </w:tc>
@@ -1891,7 +1891,7 @@
                 <w:sz w:val="19"/>
                 <w:szCs w:val="19"/>
               </w:rPr>
-              <w:t xml:space="preserve">When the symbol renders at 32px or less (flat symbol)</w:t>
+              <w:t xml:space="preserve">Website headers and mobile app bars, 28–44px tall. Small-size optical version: see below.</w:t>
             </w:r>
           </w:p>
         </w:tc>
@@ -1922,7 +1922,14 @@
                 <w:szCs w:val="18"/>
                 <w:shd w:fill="F1F5F9" w:color="auto" w:val="clear"/>
               </w:rPr>
-              <w:t xml:space="preserve">logo/lockup/resale-lockup-small.svg</w:t>
+              <w:t xml:space="preserve">logo/lockup/resale-lockup-header-{28,32,36,40,44}(-dark).svg</w:t>
+            </w:r>
+            <w:r>
+              <w:rPr>
+                <w:sz w:val="19"/>
+                <w:szCs w:val="19"/>
+              </w:rPr>
+              <w:t xml:space="preserve"> + 1×/2×/3× PNG</w:t>
             </w:r>
           </w:p>
         </w:tc>
@@ -1956,7 +1963,7 @@
                 <w:sz w:val="19"/>
                 <w:szCs w:val="19"/>
               </w:rPr>
-              <w:t xml:space="preserve">Horizontal, dark</w:t>
+              <w:t xml:space="preserve">Horizontal, flat symbol</w:t>
             </w:r>
           </w:p>
         </w:tc>
@@ -1985,23 +1992,7 @@
                 <w:sz w:val="19"/>
                 <w:szCs w:val="19"/>
               </w:rPr>
-              <w:t xml:space="preserve">Dark surfaces and dark mode: white symbol and name, Slate 400 </w:t>
-            </w:r>
-            <w:r>
-              <w:rPr>
-                <w:rFonts w:ascii="Consolas" w:cs="Consolas" w:eastAsia="Consolas" w:hAnsi="Consolas"/>
-                <w:sz w:val="18"/>
-                <w:szCs w:val="18"/>
-                <w:shd w:fill="F1F5F9" w:color="auto" w:val="clear"/>
-              </w:rPr>
-              <w:t xml:space="preserve">#94A3B8</w:t>
-            </w:r>
-            <w:r>
-              <w:rPr>
-                <w:sz w:val="19"/>
-                <w:szCs w:val="19"/>
-              </w:rPr>
-              <w:t xml:space="preserve"> domain, orange stroke and fold kept</w:t>
+              <w:t xml:space="preserve">Optional, only where gradients cannot be reproduced (e.g. some print methods)</w:t>
             </w:r>
           </w:p>
         </w:tc>
@@ -2032,7 +2023,7 @@
                 <w:szCs w:val="18"/>
                 <w:shd w:fill="F1F5F9" w:color="auto" w:val="clear"/>
               </w:rPr>
-              <w:t xml:space="preserve">logo/lockup/resale-lockup-dark.svg</w:t>
+              <w:t xml:space="preserve">logo/lockup/resale-lockup-small.svg</w:t>
             </w:r>
           </w:p>
         </w:tc>
@@ -2066,7 +2057,7 @@
                 <w:sz w:val="19"/>
                 <w:szCs w:val="19"/>
               </w:rPr>
-              <w:t xml:space="preserve">Horizontal, on teal</w:t>
+              <w:t xml:space="preserve">Horizontal, dark</w:t>
             </w:r>
           </w:p>
         </w:tc>
@@ -2095,23 +2086,23 @@
                 <w:sz w:val="19"/>
                 <w:szCs w:val="19"/>
               </w:rPr>
-              <w:t xml:space="preserve">Teal 800 surfaces: as dark, with Teal Soft 2 </w:t>
-            </w:r>
-            <w:r>
-              <w:rPr>
-                <w:rFonts w:ascii="Consolas" w:cs="Consolas" w:eastAsia="Consolas" w:hAnsi="Consolas"/>
-                <w:sz w:val="18"/>
-                <w:szCs w:val="18"/>
-                <w:shd w:fill="F1F5F9" w:color="auto" w:val="clear"/>
-              </w:rPr>
-              <w:t xml:space="preserve">#CCDCDD</w:t>
-            </w:r>
-            <w:r>
-              <w:rPr>
-                <w:sz w:val="19"/>
-                <w:szCs w:val="19"/>
-              </w:rPr>
-              <w:t xml:space="preserve"> domain</w:t>
+              <w:t xml:space="preserve">Dark surfaces and dark mode: white symbol and name, Slate 400 </w:t>
+            </w:r>
+            <w:r>
+              <w:rPr>
+                <w:rFonts w:ascii="Consolas" w:cs="Consolas" w:eastAsia="Consolas" w:hAnsi="Consolas"/>
+                <w:sz w:val="18"/>
+                <w:szCs w:val="18"/>
+                <w:shd w:fill="F1F5F9" w:color="auto" w:val="clear"/>
+              </w:rPr>
+              <w:t xml:space="preserve">#94A3B8</w:t>
+            </w:r>
+            <w:r>
+              <w:rPr>
+                <w:sz w:val="19"/>
+                <w:szCs w:val="19"/>
+              </w:rPr>
+              <w:t xml:space="preserve"> domain, orange stroke and fold kept</w:t>
             </w:r>
           </w:p>
         </w:tc>
@@ -2142,7 +2133,7 @@
                 <w:szCs w:val="18"/>
                 <w:shd w:fill="F1F5F9" w:color="auto" w:val="clear"/>
               </w:rPr>
-              <w:t xml:space="preserve">logo/lockup/resale-lockup-on-teal.svg</w:t>
+              <w:t xml:space="preserve">logo/lockup/resale-lockup-dark.svg</w:t>
             </w:r>
           </w:p>
         </w:tc>
@@ -2176,7 +2167,7 @@
                 <w:sz w:val="19"/>
                 <w:szCs w:val="19"/>
               </w:rPr>
-              <w:t xml:space="preserve">One colour, ink / white</w:t>
+              <w:t xml:space="preserve">Horizontal, on teal</w:t>
             </w:r>
           </w:p>
         </w:tc>
@@ -2205,7 +2196,23 @@
                 <w:sz w:val="19"/>
                 <w:szCs w:val="19"/>
               </w:rPr>
-              <w:t xml:space="preserve">Receipts, stamps, engraving, embroidery, reversed print. Stroke and fold take the same single colour.</w:t>
+              <w:t xml:space="preserve">Teal 800 surfaces: as dark, with Teal Soft 2 </w:t>
+            </w:r>
+            <w:r>
+              <w:rPr>
+                <w:rFonts w:ascii="Consolas" w:cs="Consolas" w:eastAsia="Consolas" w:hAnsi="Consolas"/>
+                <w:sz w:val="18"/>
+                <w:szCs w:val="18"/>
+                <w:shd w:fill="F1F5F9" w:color="auto" w:val="clear"/>
+              </w:rPr>
+              <w:t xml:space="preserve">#CCDCDD</w:t>
+            </w:r>
+            <w:r>
+              <w:rPr>
+                <w:sz w:val="19"/>
+                <w:szCs w:val="19"/>
+              </w:rPr>
+              <w:t xml:space="preserve"> domain</w:t>
             </w:r>
           </w:p>
         </w:tc>
@@ -2236,23 +2243,7 @@
                 <w:szCs w:val="18"/>
                 <w:shd w:fill="F1F5F9" w:color="auto" w:val="clear"/>
               </w:rPr>
-              <w:t xml:space="preserve">resale-lockup-ink.svg</w:t>
-            </w:r>
-            <w:r>
-              <w:rPr>
-                <w:sz w:val="19"/>
-                <w:szCs w:val="19"/>
-              </w:rPr>
-              <w:t xml:space="preserve">, </w:t>
-            </w:r>
-            <w:r>
-              <w:rPr>
-                <w:rFonts w:ascii="Consolas" w:cs="Consolas" w:eastAsia="Consolas" w:hAnsi="Consolas"/>
-                <w:sz w:val="18"/>
-                <w:szCs w:val="18"/>
-                <w:shd w:fill="F1F5F9" w:color="auto" w:val="clear"/>
-              </w:rPr>
-              <w:t xml:space="preserve">resale-lockup-white.svg</w:t>
+              <w:t xml:space="preserve">logo/lockup/resale-lockup-on-teal.svg</w:t>
             </w:r>
           </w:p>
         </w:tc>
@@ -2286,7 +2277,7 @@
                 <w:sz w:val="19"/>
                 <w:szCs w:val="19"/>
               </w:rPr>
-              <w:t xml:space="preserve">Stacked</w:t>
+              <w:t xml:space="preserve">One colour, ink / white</w:t>
             </w:r>
           </w:p>
         </w:tc>
@@ -2315,7 +2306,7 @@
                 <w:sz w:val="19"/>
                 <w:szCs w:val="19"/>
               </w:rPr>
-              <w:t xml:space="preserve">Square spaces: splash screens, stickers, posts</w:t>
+              <w:t xml:space="preserve">Receipts, stamps, engraving, embroidery, reversed print. Stroke and fold take the same single colour.</w:t>
             </w:r>
           </w:p>
         </w:tc>
@@ -2346,7 +2337,23 @@
                 <w:szCs w:val="18"/>
                 <w:shd w:fill="F1F5F9" w:color="auto" w:val="clear"/>
               </w:rPr>
-              <w:t xml:space="preserve">resale-lockup-stacked*.svg</w:t>
+              <w:t xml:space="preserve">resale-lockup-ink.svg</w:t>
+            </w:r>
+            <w:r>
+              <w:rPr>
+                <w:sz w:val="19"/>
+                <w:szCs w:val="19"/>
+              </w:rPr>
+              <w:t xml:space="preserve">, </w:t>
+            </w:r>
+            <w:r>
+              <w:rPr>
+                <w:rFonts w:ascii="Consolas" w:cs="Consolas" w:eastAsia="Consolas" w:hAnsi="Consolas"/>
+                <w:sz w:val="18"/>
+                <w:szCs w:val="18"/>
+                <w:shd w:fill="F1F5F9" w:color="auto" w:val="clear"/>
+              </w:rPr>
+              <w:t xml:space="preserve">resale-lockup-white.svg</w:t>
             </w:r>
           </w:p>
         </w:tc>
@@ -2380,6 +2387,100 @@
                 <w:sz w:val="19"/>
                 <w:szCs w:val="19"/>
               </w:rPr>
+              <w:t xml:space="preserve">Stacked</w:t>
+            </w:r>
+          </w:p>
+        </w:tc>
+        <w:tc>
+          <w:tcPr>
+            <w:tcW w:type="dxa" w:w="3280"/>
+            <w:tcBorders>
+              <w:top w:val="single" w:color="E2E8F0" w:sz="4"/>
+              <w:left w:val="single" w:color="E2E8F0" w:sz="4"/>
+              <w:bottom w:val="single" w:color="E2E8F0" w:sz="4"/>
+              <w:right w:val="single" w:color="E2E8F0" w:sz="4"/>
+            </w:tcBorders>
+            <w:tcMar>
+              <w:top w:type="dxa" w:w="60"/>
+              <w:left w:type="dxa" w:w="100"/>
+              <w:bottom w:type="dxa" w:w="60"/>
+              <w:right w:type="dxa" w:w="100"/>
+            </w:tcMar>
+          </w:tcPr>
+          <w:p>
+            <w:pPr>
+              <w:spacing w:after="0" w:before="0"/>
+            </w:pPr>
+            <w:r>
+              <w:rPr>
+                <w:sz w:val="19"/>
+                <w:szCs w:val="19"/>
+              </w:rPr>
+              <w:t xml:space="preserve">Square spaces: splash screens, stickers, posts</w:t>
+            </w:r>
+          </w:p>
+        </w:tc>
+        <w:tc>
+          <w:tcPr>
+            <w:tcW w:type="dxa" w:w="3280"/>
+            <w:tcBorders>
+              <w:top w:val="single" w:color="E2E8F0" w:sz="4"/>
+              <w:left w:val="single" w:color="E2E8F0" w:sz="4"/>
+              <w:bottom w:val="single" w:color="E2E8F0" w:sz="4"/>
+              <w:right w:val="single" w:color="E2E8F0" w:sz="4"/>
+            </w:tcBorders>
+            <w:tcMar>
+              <w:top w:type="dxa" w:w="60"/>
+              <w:left w:type="dxa" w:w="100"/>
+              <w:bottom w:type="dxa" w:w="60"/>
+              <w:right w:type="dxa" w:w="100"/>
+            </w:tcMar>
+          </w:tcPr>
+          <w:p>
+            <w:pPr>
+              <w:spacing w:after="0" w:before="0"/>
+            </w:pPr>
+            <w:r>
+              <w:rPr>
+                <w:rFonts w:ascii="Consolas" w:cs="Consolas" w:eastAsia="Consolas" w:hAnsi="Consolas"/>
+                <w:sz w:val="18"/>
+                <w:szCs w:val="18"/>
+                <w:shd w:fill="F1F5F9" w:color="auto" w:val="clear"/>
+              </w:rPr>
+              <w:t xml:space="preserve">resale-lockup-stacked*.svg</w:t>
+            </w:r>
+          </w:p>
+        </w:tc>
+      </w:tr>
+      <w:tr>
+        <w:trPr>
+          <w:tblHeader w:val="off"/>
+        </w:trPr>
+        <w:tc>
+          <w:tcPr>
+            <w:tcW w:type="dxa" w:w="3280"/>
+            <w:tcBorders>
+              <w:top w:val="single" w:color="E2E8F0" w:sz="4"/>
+              <w:left w:val="single" w:color="E2E8F0" w:sz="4"/>
+              <w:bottom w:val="single" w:color="E2E8F0" w:sz="4"/>
+              <w:right w:val="single" w:color="E2E8F0" w:sz="4"/>
+            </w:tcBorders>
+            <w:tcMar>
+              <w:top w:type="dxa" w:w="60"/>
+              <w:left w:type="dxa" w:w="100"/>
+              <w:bottom w:type="dxa" w:w="60"/>
+              <w:right w:type="dxa" w:w="100"/>
+            </w:tcMar>
+          </w:tcPr>
+          <w:p>
+            <w:pPr>
+              <w:spacing w:after="0" w:before="0"/>
+            </w:pPr>
+            <w:r>
+              <w:rPr>
+                <w:sz w:val="19"/>
+                <w:szCs w:val="19"/>
+              </w:rPr>
               <w:t xml:space="preserve">Wordmark only</w:t>
             </w:r>
           </w:p>
@@ -2453,7 +2554,619 @@
     </w:p>
     <w:p>
       <w:r>
-        <w:t xml:space="preserve">Lockup files are outlined (no font dependency). Each has a 1200px transparent PNG beside it. In live web UI the lockup may be built in HTML/CSS only if it matches this construction exactly; the reference implementation is the </w:t>
+        <w:t xml:space="preserve">Lockup files are outlined (no font dependency). Each has a 1200px transparent PNG beside it (header files have exact 1×/2×/3× PNGs instead).</w:t>
+      </w:r>
+    </w:p>
+    <w:p>
+      <w:r>
+        <w:t xml:space="preserve">The lockup always uses the </w:t>
+      </w:r>
+      <w:r>
+        <w:rPr>
+          <w:b/>
+          <w:bCs/>
+        </w:rPr>
+        <w:t xml:space="preserve">detailed full-gradient symbol</w:t>
+      </w:r>
+      <w:r>
+        <w:t xml:space="preserve">, at every size and on every device, including mobile headers. The flat symbol is only for the standalone symbol at favicon sizes (section 10).</w:t>
+      </w:r>
+    </w:p>
+    <w:p>
+      <w:pPr>
+        <w:pStyle w:val="Heading3"/>
+      </w:pPr>
+      <w:r>
+        <w:t xml:space="preserve">Header lockup (small optical size)</w:t>
+      </w:r>
+    </w:p>
+    <w:p>
+      <w:r>
+        <w:t xml:space="preserve">At header sizes the master proportions look cramped and the thin stroke falls between pixel rows. The header files are drawn for 28–44px height and differ from the master only in these optical adjustments:</w:t>
+      </w:r>
+    </w:p>
+    <w:tbl>
+      <w:tblPr>
+        <w:tblW w:type="dxa" w:w="9840"/>
+        <w:tblBorders>
+          <w:top w:val="single" w:color="auto" w:sz="4"/>
+          <w:left w:val="single" w:color="auto" w:sz="4"/>
+          <w:bottom w:val="single" w:color="auto" w:sz="4"/>
+          <w:right w:val="single" w:color="auto" w:sz="4"/>
+          <w:insideH w:val="single" w:color="auto" w:sz="4"/>
+          <w:insideV w:val="single" w:color="auto" w:sz="4"/>
+        </w:tblBorders>
+      </w:tblPr>
+      <w:tblGrid>
+        <w:gridCol w:w="3280"/>
+        <w:gridCol w:w="3280"/>
+        <w:gridCol w:w="3280"/>
+      </w:tblGrid>
+      <w:tr>
+        <w:trPr>
+          <w:tblHeader/>
+        </w:trPr>
+        <w:tc>
+          <w:tcPr>
+            <w:tcW w:type="dxa" w:w="3280"/>
+            <w:tcBorders>
+              <w:top w:val="single" w:color="E2E8F0" w:sz="4"/>
+              <w:left w:val="single" w:color="E2E8F0" w:sz="4"/>
+              <w:bottom w:val="single" w:color="E2E8F0" w:sz="4"/>
+              <w:right w:val="single" w:color="E2E8F0" w:sz="4"/>
+            </w:tcBorders>
+            <w:shd w:fill="F1F5F9" w:color="auto" w:val="clear"/>
+            <w:tcMar>
+              <w:top w:type="dxa" w:w="60"/>
+              <w:left w:type="dxa" w:w="100"/>
+              <w:bottom w:type="dxa" w:w="60"/>
+              <w:right w:type="dxa" w:w="100"/>
+            </w:tcMar>
+          </w:tcPr>
+          <w:p>
+            <w:pPr>
+              <w:spacing w:after="0" w:before="0"/>
+            </w:pPr>
+            <w:r>
+              <w:rPr>
+                <w:b/>
+                <w:bCs/>
+                <w:color w:val="64748B"/>
+                <w:sz w:val="18"/>
+                <w:szCs w:val="18"/>
+              </w:rPr>
+              <w:t xml:space="preserve">Element</w:t>
+            </w:r>
+          </w:p>
+        </w:tc>
+        <w:tc>
+          <w:tcPr>
+            <w:tcW w:type="dxa" w:w="3280"/>
+            <w:tcBorders>
+              <w:top w:val="single" w:color="E2E8F0" w:sz="4"/>
+              <w:left w:val="single" w:color="E2E8F0" w:sz="4"/>
+              <w:bottom w:val="single" w:color="E2E8F0" w:sz="4"/>
+              <w:right w:val="single" w:color="E2E8F0" w:sz="4"/>
+            </w:tcBorders>
+            <w:shd w:fill="F1F5F9" w:color="auto" w:val="clear"/>
+            <w:tcMar>
+              <w:top w:type="dxa" w:w="60"/>
+              <w:left w:type="dxa" w:w="100"/>
+              <w:bottom w:type="dxa" w:w="60"/>
+              <w:right w:type="dxa" w:w="100"/>
+            </w:tcMar>
+          </w:tcPr>
+          <w:p>
+            <w:pPr>
+              <w:spacing w:after="0" w:before="0"/>
+            </w:pPr>
+            <w:r>
+              <w:rPr>
+                <w:b/>
+                <w:bCs/>
+                <w:color w:val="64748B"/>
+                <w:sz w:val="18"/>
+                <w:szCs w:val="18"/>
+              </w:rPr>
+              <w:t xml:space="preserve">Master</w:t>
+            </w:r>
+          </w:p>
+        </w:tc>
+        <w:tc>
+          <w:tcPr>
+            <w:tcW w:type="dxa" w:w="3280"/>
+            <w:tcBorders>
+              <w:top w:val="single" w:color="E2E8F0" w:sz="4"/>
+              <w:left w:val="single" w:color="E2E8F0" w:sz="4"/>
+              <w:bottom w:val="single" w:color="E2E8F0" w:sz="4"/>
+              <w:right w:val="single" w:color="E2E8F0" w:sz="4"/>
+            </w:tcBorders>
+            <w:shd w:fill="F1F5F9" w:color="auto" w:val="clear"/>
+            <w:tcMar>
+              <w:top w:type="dxa" w:w="60"/>
+              <w:left w:type="dxa" w:w="100"/>
+              <w:bottom w:type="dxa" w:w="60"/>
+              <w:right w:type="dxa" w:w="100"/>
+            </w:tcMar>
+          </w:tcPr>
+          <w:p>
+            <w:pPr>
+              <w:spacing w:after="0" w:before="0"/>
+            </w:pPr>
+            <w:r>
+              <w:rPr>
+                <w:b/>
+                <w:bCs/>
+                <w:color w:val="64748B"/>
+                <w:sz w:val="18"/>
+                <w:szCs w:val="18"/>
+              </w:rPr>
+              <w:t xml:space="preserve">Header version</w:t>
+            </w:r>
+          </w:p>
+        </w:tc>
+      </w:tr>
+      <w:tr>
+        <w:trPr>
+          <w:tblHeader w:val="off"/>
+        </w:trPr>
+        <w:tc>
+          <w:tcPr>
+            <w:tcW w:type="dxa" w:w="3280"/>
+            <w:tcBorders>
+              <w:top w:val="single" w:color="E2E8F0" w:sz="4"/>
+              <w:left w:val="single" w:color="E2E8F0" w:sz="4"/>
+              <w:bottom w:val="single" w:color="E2E8F0" w:sz="4"/>
+              <w:right w:val="single" w:color="E2E8F0" w:sz="4"/>
+            </w:tcBorders>
+            <w:tcMar>
+              <w:top w:type="dxa" w:w="60"/>
+              <w:left w:type="dxa" w:w="100"/>
+              <w:bottom w:type="dxa" w:w="60"/>
+              <w:right w:type="dxa" w:w="100"/>
+            </w:tcMar>
+          </w:tcPr>
+          <w:p>
+            <w:pPr>
+              <w:spacing w:after="0" w:before="0"/>
+            </w:pPr>
+            <w:r>
+              <w:rPr>
+                <w:sz w:val="19"/>
+                <w:szCs w:val="19"/>
+              </w:rPr>
+              <w:t xml:space="preserve">Name letter-spacing</w:t>
+            </w:r>
+          </w:p>
+        </w:tc>
+        <w:tc>
+          <w:tcPr>
+            <w:tcW w:type="dxa" w:w="3280"/>
+            <w:tcBorders>
+              <w:top w:val="single" w:color="E2E8F0" w:sz="4"/>
+              <w:left w:val="single" w:color="E2E8F0" w:sz="4"/>
+              <w:bottom w:val="single" w:color="E2E8F0" w:sz="4"/>
+              <w:right w:val="single" w:color="E2E8F0" w:sz="4"/>
+            </w:tcBorders>
+            <w:tcMar>
+              <w:top w:type="dxa" w:w="60"/>
+              <w:left w:type="dxa" w:w="100"/>
+              <w:bottom w:type="dxa" w:w="60"/>
+              <w:right w:type="dxa" w:w="100"/>
+            </w:tcMar>
+          </w:tcPr>
+          <w:p>
+            <w:pPr>
+              <w:spacing w:after="0" w:before="0"/>
+            </w:pPr>
+            <w:r>
+              <w:rPr>
+                <w:sz w:val="19"/>
+                <w:szCs w:val="19"/>
+              </w:rPr>
+              <w:t xml:space="preserve">−2%</w:t>
+            </w:r>
+          </w:p>
+        </w:tc>
+        <w:tc>
+          <w:tcPr>
+            <w:tcW w:type="dxa" w:w="3280"/>
+            <w:tcBorders>
+              <w:top w:val="single" w:color="E2E8F0" w:sz="4"/>
+              <w:left w:val="single" w:color="E2E8F0" w:sz="4"/>
+              <w:bottom w:val="single" w:color="E2E8F0" w:sz="4"/>
+              <w:right w:val="single" w:color="E2E8F0" w:sz="4"/>
+            </w:tcBorders>
+            <w:tcMar>
+              <w:top w:type="dxa" w:w="60"/>
+              <w:left w:type="dxa" w:w="100"/>
+              <w:bottom w:type="dxa" w:w="60"/>
+              <w:right w:type="dxa" w:w="100"/>
+            </w:tcMar>
+          </w:tcPr>
+          <w:p>
+            <w:pPr>
+              <w:spacing w:after="0" w:before="0"/>
+            </w:pPr>
+            <w:r>
+              <w:rPr>
+                <w:sz w:val="19"/>
+                <w:szCs w:val="19"/>
+              </w:rPr>
+              <w:t xml:space="preserve">−0.5%</w:t>
+            </w:r>
+          </w:p>
+        </w:tc>
+      </w:tr>
+      <w:tr>
+        <w:trPr>
+          <w:tblHeader w:val="off"/>
+        </w:trPr>
+        <w:tc>
+          <w:tcPr>
+            <w:tcW w:type="dxa" w:w="3280"/>
+            <w:tcBorders>
+              <w:top w:val="single" w:color="E2E8F0" w:sz="4"/>
+              <w:left w:val="single" w:color="E2E8F0" w:sz="4"/>
+              <w:bottom w:val="single" w:color="E2E8F0" w:sz="4"/>
+              <w:right w:val="single" w:color="E2E8F0" w:sz="4"/>
+            </w:tcBorders>
+            <w:tcMar>
+              <w:top w:type="dxa" w:w="60"/>
+              <w:left w:type="dxa" w:w="100"/>
+              <w:bottom w:type="dxa" w:w="60"/>
+              <w:right w:type="dxa" w:w="100"/>
+            </w:tcMar>
+          </w:tcPr>
+          <w:p>
+            <w:pPr>
+              <w:spacing w:after="0" w:before="0"/>
+            </w:pPr>
+            <w:r>
+              <w:rPr>
+                <w:sz w:val="19"/>
+                <w:szCs w:val="19"/>
+              </w:rPr>
+              <w:t xml:space="preserve">".com.pk"</w:t>
+            </w:r>
+          </w:p>
+        </w:tc>
+        <w:tc>
+          <w:tcPr>
+            <w:tcW w:type="dxa" w:w="3280"/>
+            <w:tcBorders>
+              <w:top w:val="single" w:color="E2E8F0" w:sz="4"/>
+              <w:left w:val="single" w:color="E2E8F0" w:sz="4"/>
+              <w:bottom w:val="single" w:color="E2E8F0" w:sz="4"/>
+              <w:right w:val="single" w:color="E2E8F0" w:sz="4"/>
+            </w:tcBorders>
+            <w:tcMar>
+              <w:top w:type="dxa" w:w="60"/>
+              <w:left w:type="dxa" w:w="100"/>
+              <w:bottom w:type="dxa" w:w="60"/>
+              <w:right w:type="dxa" w:w="100"/>
+            </w:tcMar>
+          </w:tcPr>
+          <w:p>
+            <w:pPr>
+              <w:spacing w:after="0" w:before="0"/>
+            </w:pPr>
+            <w:r>
+              <w:rPr>
+                <w:sz w:val="19"/>
+                <w:szCs w:val="19"/>
+              </w:rPr>
+              <w:t xml:space="preserve">Inter 700 at 0.7 N, −2%</w:t>
+            </w:r>
+          </w:p>
+        </w:tc>
+        <w:tc>
+          <w:tcPr>
+            <w:tcW w:type="dxa" w:w="3280"/>
+            <w:tcBorders>
+              <w:top w:val="single" w:color="E2E8F0" w:sz="4"/>
+              <w:left w:val="single" w:color="E2E8F0" w:sz="4"/>
+              <w:bottom w:val="single" w:color="E2E8F0" w:sz="4"/>
+              <w:right w:val="single" w:color="E2E8F0" w:sz="4"/>
+            </w:tcBorders>
+            <w:tcMar>
+              <w:top w:type="dxa" w:w="60"/>
+              <w:left w:type="dxa" w:w="100"/>
+              <w:bottom w:type="dxa" w:w="60"/>
+              <w:right w:type="dxa" w:w="100"/>
+            </w:tcMar>
+          </w:tcPr>
+          <w:p>
+            <w:pPr>
+              <w:spacing w:after="0" w:before="0"/>
+            </w:pPr>
+            <w:r>
+              <w:rPr>
+                <w:sz w:val="19"/>
+                <w:szCs w:val="19"/>
+              </w:rPr>
+              <w:t xml:space="preserve">Inter </w:t>
+            </w:r>
+            <w:r>
+              <w:rPr>
+                <w:b/>
+                <w:bCs/>
+                <w:sz w:val="19"/>
+                <w:szCs w:val="19"/>
+              </w:rPr>
+              <w:t xml:space="preserve">600</w:t>
+            </w:r>
+            <w:r>
+              <w:rPr>
+                <w:sz w:val="19"/>
+                <w:szCs w:val="19"/>
+              </w:rPr>
+              <w:t xml:space="preserve"> at </w:t>
+            </w:r>
+            <w:r>
+              <w:rPr>
+                <w:b/>
+                <w:bCs/>
+                <w:sz w:val="19"/>
+                <w:szCs w:val="19"/>
+              </w:rPr>
+              <w:t xml:space="preserve">0.72 N</w:t>
+            </w:r>
+            <w:r>
+              <w:rPr>
+                <w:sz w:val="19"/>
+                <w:szCs w:val="19"/>
+              </w:rPr>
+              <w:t xml:space="preserve">, </w:t>
+            </w:r>
+            <w:r>
+              <w:rPr>
+                <w:b/>
+                <w:bCs/>
+                <w:sz w:val="19"/>
+                <w:szCs w:val="19"/>
+              </w:rPr>
+              <w:t xml:space="preserve">+1.2%</w:t>
+            </w:r>
+            <w:r>
+              <w:rPr>
+                <w:sz w:val="19"/>
+                <w:szCs w:val="19"/>
+              </w:rPr>
+              <w:t xml:space="preserve"> letter-spacing</w:t>
+            </w:r>
+          </w:p>
+        </w:tc>
+      </w:tr>
+      <w:tr>
+        <w:trPr>
+          <w:tblHeader w:val="off"/>
+        </w:trPr>
+        <w:tc>
+          <w:tcPr>
+            <w:tcW w:type="dxa" w:w="3280"/>
+            <w:tcBorders>
+              <w:top w:val="single" w:color="E2E8F0" w:sz="4"/>
+              <w:left w:val="single" w:color="E2E8F0" w:sz="4"/>
+              <w:bottom w:val="single" w:color="E2E8F0" w:sz="4"/>
+              <w:right w:val="single" w:color="E2E8F0" w:sz="4"/>
+            </w:tcBorders>
+            <w:tcMar>
+              <w:top w:type="dxa" w:w="60"/>
+              <w:left w:type="dxa" w:w="100"/>
+              <w:bottom w:type="dxa" w:w="60"/>
+              <w:right w:type="dxa" w:w="100"/>
+            </w:tcMar>
+          </w:tcPr>
+          <w:p>
+            <w:pPr>
+              <w:spacing w:after="0" w:before="0"/>
+            </w:pPr>
+            <w:r>
+              <w:rPr>
+                <w:sz w:val="19"/>
+                <w:szCs w:val="19"/>
+              </w:rPr>
+              <w:t xml:space="preserve">Symbol gap</w:t>
+            </w:r>
+          </w:p>
+        </w:tc>
+        <w:tc>
+          <w:tcPr>
+            <w:tcW w:type="dxa" w:w="3280"/>
+            <w:tcBorders>
+              <w:top w:val="single" w:color="E2E8F0" w:sz="4"/>
+              <w:left w:val="single" w:color="E2E8F0" w:sz="4"/>
+              <w:bottom w:val="single" w:color="E2E8F0" w:sz="4"/>
+              <w:right w:val="single" w:color="E2E8F0" w:sz="4"/>
+            </w:tcBorders>
+            <w:tcMar>
+              <w:top w:type="dxa" w:w="60"/>
+              <w:left w:type="dxa" w:w="100"/>
+              <w:bottom w:type="dxa" w:w="60"/>
+              <w:right w:type="dxa" w:w="100"/>
+            </w:tcMar>
+          </w:tcPr>
+          <w:p>
+            <w:pPr>
+              <w:spacing w:after="0" w:before="0"/>
+            </w:pPr>
+            <w:r>
+              <w:rPr>
+                <w:sz w:val="19"/>
+                <w:szCs w:val="19"/>
+              </w:rPr>
+              <w:t xml:space="preserve">0.42 N</w:t>
+            </w:r>
+          </w:p>
+        </w:tc>
+        <w:tc>
+          <w:tcPr>
+            <w:tcW w:type="dxa" w:w="3280"/>
+            <w:tcBorders>
+              <w:top w:val="single" w:color="E2E8F0" w:sz="4"/>
+              <w:left w:val="single" w:color="E2E8F0" w:sz="4"/>
+              <w:bottom w:val="single" w:color="E2E8F0" w:sz="4"/>
+              <w:right w:val="single" w:color="E2E8F0" w:sz="4"/>
+            </w:tcBorders>
+            <w:tcMar>
+              <w:top w:type="dxa" w:w="60"/>
+              <w:left w:type="dxa" w:w="100"/>
+              <w:bottom w:type="dxa" w:w="60"/>
+              <w:right w:type="dxa" w:w="100"/>
+            </w:tcMar>
+          </w:tcPr>
+          <w:p>
+            <w:pPr>
+              <w:spacing w:after="0" w:before="0"/>
+            </w:pPr>
+            <w:r>
+              <w:rPr>
+                <w:sz w:val="19"/>
+                <w:szCs w:val="19"/>
+              </w:rPr>
+              <w:t xml:space="preserve">0.45 N</w:t>
+            </w:r>
+          </w:p>
+        </w:tc>
+      </w:tr>
+      <w:tr>
+        <w:trPr>
+          <w:tblHeader w:val="off"/>
+        </w:trPr>
+        <w:tc>
+          <w:tcPr>
+            <w:tcW w:type="dxa" w:w="3280"/>
+            <w:tcBorders>
+              <w:top w:val="single" w:color="E2E8F0" w:sz="4"/>
+              <w:left w:val="single" w:color="E2E8F0" w:sz="4"/>
+              <w:bottom w:val="single" w:color="E2E8F0" w:sz="4"/>
+              <w:right w:val="single" w:color="E2E8F0" w:sz="4"/>
+            </w:tcBorders>
+            <w:tcMar>
+              <w:top w:type="dxa" w:w="60"/>
+              <w:left w:type="dxa" w:w="100"/>
+              <w:bottom w:type="dxa" w:w="60"/>
+              <w:right w:type="dxa" w:w="100"/>
+            </w:tcMar>
+          </w:tcPr>
+          <w:p>
+            <w:pPr>
+              <w:spacing w:after="0" w:before="0"/>
+            </w:pPr>
+            <w:r>
+              <w:rPr>
+                <w:sz w:val="19"/>
+                <w:szCs w:val="19"/>
+              </w:rPr>
+              <w:t xml:space="preserve">Baseline, stroke, fold</w:t>
+            </w:r>
+          </w:p>
+        </w:tc>
+        <w:tc>
+          <w:tcPr>
+            <w:tcW w:type="dxa" w:w="3280"/>
+            <w:tcBorders>
+              <w:top w:val="single" w:color="E2E8F0" w:sz="4"/>
+              <w:left w:val="single" w:color="E2E8F0" w:sz="4"/>
+              <w:bottom w:val="single" w:color="E2E8F0" w:sz="4"/>
+              <w:right w:val="single" w:color="E2E8F0" w:sz="4"/>
+            </w:tcBorders>
+            <w:tcMar>
+              <w:top w:type="dxa" w:w="60"/>
+              <w:left w:type="dxa" w:w="100"/>
+              <w:bottom w:type="dxa" w:w="60"/>
+              <w:right w:type="dxa" w:w="100"/>
+            </w:tcMar>
+          </w:tcPr>
+          <w:p>
+            <w:pPr>
+              <w:spacing w:after="0" w:before="0"/>
+            </w:pPr>
+            <w:r>
+              <w:rPr>
+                <w:sz w:val="19"/>
+                <w:szCs w:val="19"/>
+              </w:rPr>
+              <w:t xml:space="preserve">Proportional</w:t>
+            </w:r>
+          </w:p>
+        </w:tc>
+        <w:tc>
+          <w:tcPr>
+            <w:tcW w:type="dxa" w:w="3280"/>
+            <w:tcBorders>
+              <w:top w:val="single" w:color="E2E8F0" w:sz="4"/>
+              <w:left w:val="single" w:color="E2E8F0" w:sz="4"/>
+              <w:bottom w:val="single" w:color="E2E8F0" w:sz="4"/>
+              <w:right w:val="single" w:color="E2E8F0" w:sz="4"/>
+            </w:tcBorders>
+            <w:tcMar>
+              <w:top w:type="dxa" w:w="60"/>
+              <w:left w:type="dxa" w:w="100"/>
+              <w:bottom w:type="dxa" w:w="60"/>
+              <w:right w:type="dxa" w:w="100"/>
+            </w:tcMar>
+          </w:tcPr>
+          <w:p>
+            <w:pPr>
+              <w:spacing w:after="0" w:before="0"/>
+            </w:pPr>
+            <w:r>
+              <w:rPr>
+                <w:sz w:val="19"/>
+                <w:szCs w:val="19"/>
+              </w:rPr>
+              <w:t xml:space="preserve">Snapped to whole pixels; stroke never under 2px</w:t>
+            </w:r>
+          </w:p>
+        </w:tc>
+      </w:tr>
+    </w:tbl>
+    <w:p>
+      <w:pPr>
+        <w:spacing w:after="60"/>
+      </w:pPr>
+    </w:p>
+    <w:p>
+      <w:r>
+        <w:t xml:space="preserve">Use a header file at its exact size: set the </w:t>
+      </w:r>
+      <w:r>
+        <w:rPr>
+          <w:rFonts w:ascii="Consolas" w:cs="Consolas" w:eastAsia="Consolas" w:hAnsi="Consolas"/>
+          <w:sz w:val="18"/>
+          <w:szCs w:val="18"/>
+          <w:shd w:fill="F1F5F9" w:color="auto" w:val="clear"/>
+        </w:rPr>
+        <w:t xml:space="preserve">&lt;img&gt;</w:t>
+      </w:r>
+      <w:r>
+        <w:t xml:space="preserve"> height to the number in the filename (e.g. </w:t>
+      </w:r>
+      <w:r>
+        <w:rPr>
+          <w:rFonts w:ascii="Consolas" w:cs="Consolas" w:eastAsia="Consolas" w:hAnsi="Consolas"/>
+          <w:sz w:val="18"/>
+          <w:szCs w:val="18"/>
+          <w:shd w:fill="F1F5F9" w:color="auto" w:val="clear"/>
+        </w:rPr>
+        <w:t xml:space="preserve">height="36"</w:t>
+      </w:r>
+      <w:r>
+        <w:t xml:space="preserve">) and let the width follow. Do not scale it with CSS transforms, do not use fractional sizes, and do not set </w:t>
+      </w:r>
+      <w:r>
+        <w:rPr>
+          <w:rFonts w:ascii="Consolas" w:cs="Consolas" w:eastAsia="Consolas" w:hAnsi="Consolas"/>
+          <w:sz w:val="18"/>
+          <w:szCs w:val="18"/>
+          <w:shd w:fill="F1F5F9" w:color="auto" w:val="clear"/>
+        </w:rPr>
+        <w:t xml:space="preserve">shape-rendering="crispEdges"</w:t>
+      </w:r>
+      <w:r>
+        <w:t xml:space="preserve">. Native apps use the @2x/@3x PNGs at the matching point size. In live web UI the lockup may be built in HTML/CSS only if it matches this construction exactly; the reference implementation is the </w:t>
       </w:r>
       <w:r>
         <w:rPr>
@@ -15047,14 +15760,39 @@
                 <w:szCs w:val="18"/>
                 <w:shd w:fill="F1F5F9" w:color="auto" w:val="clear"/>
               </w:rPr>
-              <w:t xml:space="preserve">34–37px</w:t>
-            </w:r>
-            <w:r>
-              <w:rPr>
-                <w:sz w:val="19"/>
-                <w:szCs w:val="19"/>
-              </w:rPr>
-              <w:t xml:space="preserve">, full gradient</w:t>
+              <w:t xml:space="preserve">36–40px</w:t>
+            </w:r>
+            <w:r>
+              <w:rPr>
+                <w:sz w:val="19"/>
+                <w:szCs w:val="19"/>
+              </w:rPr>
+              <w:t xml:space="preserve">: </w:t>
+            </w:r>
+            <w:r>
+              <w:rPr>
+                <w:rFonts w:ascii="Consolas" w:cs="Consolas" w:eastAsia="Consolas" w:hAnsi="Consolas"/>
+                <w:sz w:val="18"/>
+                <w:szCs w:val="18"/>
+                <w:shd w:fill="F1F5F9" w:color="auto" w:val="clear"/>
+              </w:rPr>
+              <w:t xml:space="preserve">resale-lockup-header-36</w:t>
+            </w:r>
+            <w:r>
+              <w:rPr>
+                <w:sz w:val="19"/>
+                <w:szCs w:val="19"/>
+              </w:rPr>
+              <w:t xml:space="preserve"> or </w:t>
+            </w:r>
+            <w:r>
+              <w:rPr>
+                <w:rFonts w:ascii="Consolas" w:cs="Consolas" w:eastAsia="Consolas" w:hAnsi="Consolas"/>
+                <w:sz w:val="18"/>
+                <w:szCs w:val="18"/>
+                <w:shd w:fill="F1F5F9" w:color="auto" w:val="clear"/>
+              </w:rPr>
+              <w:t xml:space="preserve">-40</w:t>
             </w:r>
           </w:p>
         </w:tc>
@@ -15119,7 +15857,7 @@
                 <w:szCs w:val="18"/>
                 <w:shd w:fill="F1F5F9" w:color="auto" w:val="clear"/>
               </w:rPr>
-              <w:t xml:space="preserve">18–19px</w:t>
+              <w:t xml:space="preserve">18–21px</w:t>
             </w:r>
           </w:p>
         </w:tc>
@@ -15150,14 +15888,39 @@
                 <w:szCs w:val="18"/>
                 <w:shd w:fill="F1F5F9" w:color="auto" w:val="clear"/>
               </w:rPr>
-              <w:t xml:space="preserve">28–30px</w:t>
-            </w:r>
-            <w:r>
-              <w:rPr>
-                <w:sz w:val="19"/>
-                <w:szCs w:val="19"/>
-              </w:rPr>
-              <w:t xml:space="preserve">, flat</w:t>
+              <w:t xml:space="preserve">28–32px</w:t>
+            </w:r>
+            <w:r>
+              <w:rPr>
+                <w:sz w:val="19"/>
+                <w:szCs w:val="19"/>
+              </w:rPr>
+              <w:t xml:space="preserve">: </w:t>
+            </w:r>
+            <w:r>
+              <w:rPr>
+                <w:rFonts w:ascii="Consolas" w:cs="Consolas" w:eastAsia="Consolas" w:hAnsi="Consolas"/>
+                <w:sz w:val="18"/>
+                <w:szCs w:val="18"/>
+                <w:shd w:fill="F1F5F9" w:color="auto" w:val="clear"/>
+              </w:rPr>
+              <w:t xml:space="preserve">resale-lockup-header-28</w:t>
+            </w:r>
+            <w:r>
+              <w:rPr>
+                <w:sz w:val="19"/>
+                <w:szCs w:val="19"/>
+              </w:rPr>
+              <w:t xml:space="preserve"> or </w:t>
+            </w:r>
+            <w:r>
+              <w:rPr>
+                <w:rFonts w:ascii="Consolas" w:cs="Consolas" w:eastAsia="Consolas" w:hAnsi="Consolas"/>
+                <w:sz w:val="18"/>
+                <w:szCs w:val="18"/>
+                <w:shd w:fill="F1F5F9" w:color="auto" w:val="clear"/>
+              </w:rPr>
+              <w:t xml:space="preserve">-32</w:t>
             </w:r>
           </w:p>
         </w:tc>
@@ -15222,7 +15985,7 @@
                 <w:szCs w:val="18"/>
                 <w:shd w:fill="F1F5F9" w:color="auto" w:val="clear"/>
               </w:rPr>
-              <w:t xml:space="preserve">18–20px</w:t>
+              <w:t xml:space="preserve">18–21px</w:t>
             </w:r>
           </w:p>
         </w:tc>
@@ -15253,14 +16016,39 @@
                 <w:szCs w:val="18"/>
                 <w:shd w:fill="F1F5F9" w:color="auto" w:val="clear"/>
               </w:rPr>
-              <w:t xml:space="preserve">28–31px</w:t>
-            </w:r>
-            <w:r>
-              <w:rPr>
-                <w:sz w:val="19"/>
-                <w:szCs w:val="19"/>
-              </w:rPr>
-              <w:t xml:space="preserve">, flat</w:t>
+              <w:t xml:space="preserve">28–32px</w:t>
+            </w:r>
+            <w:r>
+              <w:rPr>
+                <w:sz w:val="19"/>
+                <w:szCs w:val="19"/>
+              </w:rPr>
+              <w:t xml:space="preserve">: </w:t>
+            </w:r>
+            <w:r>
+              <w:rPr>
+                <w:rFonts w:ascii="Consolas" w:cs="Consolas" w:eastAsia="Consolas" w:hAnsi="Consolas"/>
+                <w:sz w:val="18"/>
+                <w:szCs w:val="18"/>
+                <w:shd w:fill="F1F5F9" w:color="auto" w:val="clear"/>
+              </w:rPr>
+              <w:t xml:space="preserve">resale-lockup-header-28</w:t>
+            </w:r>
+            <w:r>
+              <w:rPr>
+                <w:sz w:val="19"/>
+                <w:szCs w:val="19"/>
+              </w:rPr>
+              <w:t xml:space="preserve"> or </w:t>
+            </w:r>
+            <w:r>
+              <w:rPr>
+                <w:rFonts w:ascii="Consolas" w:cs="Consolas" w:eastAsia="Consolas" w:hAnsi="Consolas"/>
+                <w:sz w:val="18"/>
+                <w:szCs w:val="18"/>
+                <w:shd w:fill="F1F5F9" w:color="auto" w:val="clear"/>
+              </w:rPr>
+              <w:t xml:space="preserve">-32</w:t>
             </w:r>
           </w:p>
         </w:tc>
@@ -15354,7 +16142,7 @@
                 <w:sz w:val="19"/>
                 <w:szCs w:val="19"/>
               </w:rPr>
-              <w:t xml:space="preserve">Flat or full gradient by size</w:t>
+              <w:t xml:space="preserve">Header file of matching size, or the master lockup</w:t>
             </w:r>
           </w:p>
         </w:tc>
@@ -15725,7 +16513,23 @@
                 <w:sz w:val="19"/>
                 <w:szCs w:val="19"/>
               </w:rPr>
-              <w:t xml:space="preserve">; no shadows or micro-gradients</w:t>
+              <w:t xml:space="preserve">; no shadows or micro-gradients. Applies to the </w:t>
+            </w:r>
+            <w:r>
+              <w:rPr>
+                <w:b/>
+                <w:bCs/>
+                <w:sz w:val="19"/>
+                <w:szCs w:val="19"/>
+              </w:rPr>
+              <w:t xml:space="preserve">standalone symbol</w:t>
+            </w:r>
+            <w:r>
+              <w:rPr>
+                <w:sz w:val="19"/>
+                <w:szCs w:val="19"/>
+              </w:rPr>
+              <w:t xml:space="preserve"> (favicons, tiny UI icons) only; the lockup keeps the full-gradient symbol at all sizes.</w:t>
             </w:r>
           </w:p>
         </w:tc>
@@ -21770,6 +22574,98 @@
                 <w:szCs w:val="18"/>
               </w:rPr>
               <w:t xml:space="preserve">Change</w:t>
+            </w:r>
+          </w:p>
+        </w:tc>
+      </w:tr>
+      <w:tr>
+        <w:trPr>
+          <w:tblHeader w:val="off"/>
+        </w:trPr>
+        <w:tc>
+          <w:tcPr>
+            <w:tcW w:type="dxa" w:w="3280"/>
+            <w:tcBorders>
+              <w:top w:val="single" w:color="E2E8F0" w:sz="4"/>
+              <w:left w:val="single" w:color="E2E8F0" w:sz="4"/>
+              <w:bottom w:val="single" w:color="E2E8F0" w:sz="4"/>
+              <w:right w:val="single" w:color="E2E8F0" w:sz="4"/>
+            </w:tcBorders>
+            <w:tcMar>
+              <w:top w:type="dxa" w:w="60"/>
+              <w:left w:type="dxa" w:w="100"/>
+              <w:bottom w:type="dxa" w:w="60"/>
+              <w:right w:type="dxa" w:w="100"/>
+            </w:tcMar>
+          </w:tcPr>
+          <w:p>
+            <w:pPr>
+              <w:spacing w:after="0" w:before="0"/>
+            </w:pPr>
+            <w:r>
+              <w:rPr>
+                <w:sz w:val="19"/>
+                <w:szCs w:val="19"/>
+              </w:rPr>
+              <w:t xml:space="preserve">1.2</w:t>
+            </w:r>
+          </w:p>
+        </w:tc>
+        <w:tc>
+          <w:tcPr>
+            <w:tcW w:type="dxa" w:w="3280"/>
+            <w:tcBorders>
+              <w:top w:val="single" w:color="E2E8F0" w:sz="4"/>
+              <w:left w:val="single" w:color="E2E8F0" w:sz="4"/>
+              <w:bottom w:val="single" w:color="E2E8F0" w:sz="4"/>
+              <w:right w:val="single" w:color="E2E8F0" w:sz="4"/>
+            </w:tcBorders>
+            <w:tcMar>
+              <w:top w:type="dxa" w:w="60"/>
+              <w:left w:type="dxa" w:w="100"/>
+              <w:bottom w:type="dxa" w:w="60"/>
+              <w:right w:type="dxa" w:w="100"/>
+            </w:tcMar>
+          </w:tcPr>
+          <w:p>
+            <w:pPr>
+              <w:spacing w:after="0" w:before="0"/>
+            </w:pPr>
+            <w:r>
+              <w:rPr>
+                <w:sz w:val="19"/>
+                <w:szCs w:val="19"/>
+              </w:rPr>
+              <w:t xml:space="preserve">3 October 2026</w:t>
+            </w:r>
+          </w:p>
+        </w:tc>
+        <w:tc>
+          <w:tcPr>
+            <w:tcW w:type="dxa" w:w="3280"/>
+            <w:tcBorders>
+              <w:top w:val="single" w:color="E2E8F0" w:sz="4"/>
+              <w:left w:val="single" w:color="E2E8F0" w:sz="4"/>
+              <w:bottom w:val="single" w:color="E2E8F0" w:sz="4"/>
+              <w:right w:val="single" w:color="E2E8F0" w:sz="4"/>
+            </w:tcBorders>
+            <w:tcMar>
+              <w:top w:type="dxa" w:w="60"/>
+              <w:left w:type="dxa" w:w="100"/>
+              <w:bottom w:type="dxa" w:w="60"/>
+              <w:right w:type="dxa" w:w="100"/>
+            </w:tcMar>
+          </w:tcPr>
+          <w:p>
+            <w:pPr>
+              <w:spacing w:after="0" w:before="0"/>
+            </w:pPr>
+            <w:r>
+              <w:rPr>
+                <w:sz w:val="19"/>
+                <w:szCs w:val="19"/>
+              </w:rPr>
+              <w:t xml:space="preserve">Added pixel-fitted header lockups (28–44px, light and dark, 1×/2×/3× PNG) with small-size optical adjustments so the wordmark stays clear in headers. The lockup now uses the detailed full-gradient symbol at every size, including mobile.</w:t>
             </w:r>
           </w:p>
         </w:tc>
@@ -22087,7 +22983,7 @@
         <w:sz w:val="16"/>
         <w:szCs w:val="16"/>
       </w:rPr>
-      <w:t xml:space="preserve">resale.com.pk · Brand and UI guidelines · v1.1</w:t>
+      <w:t xml:space="preserve">resale.com.pk · Brand and UI guidelines · v1.2</w:t>
     </w:r>
   </w:p>
 </w:hdr>

</xml_diff>

<commit_message>
Header lockups to fit phone headers; add email and login sizes (v1.3)
Per the web team's requests:
- header-36 capped at 180px and header-28 at 140px wide (fits beside three
  44px buttons), by tightening the symbol gap and name tracking slightly
- new header-42 (email, 212x42) and header-48 (login page), light and dark
- guidelines: phones 360-639px use header-36, 320-359px use header-28
  (full lockup kept, .com.pk stays visible); change log v1.3
- kit v1.3 README rows for each use

Co-Authored-By: Claude Opus 5.5 <noreply@anthropic.com>
</commit_message>
<xml_diff>
--- a/resale-brand-ui-guidelines-v1.docx
+++ b/resale-brand-ui-guidelines-v1.docx
@@ -75,7 +75,7 @@
           <w:sz w:val="22"/>
           <w:szCs w:val="22"/>
         </w:rPr>
-        <w:t xml:space="preserve">Version 1.2 (3 October 2026)</w:t>
+        <w:t xml:space="preserve">Version 1.3 (3 October 2026)</w:t>
       </w:r>
     </w:p>
     <w:p>
@@ -1891,7 +1891,7 @@
                 <w:sz w:val="19"/>
                 <w:szCs w:val="19"/>
               </w:rPr>
-              <w:t xml:space="preserve">Website headers and mobile app bars, 28–44px tall. Small-size optical version: see below.</w:t>
+              <w:t xml:space="preserve">Website headers, mobile app bars, login page and email, 28–48px tall. Small-size optical version: see below.</w:t>
             </w:r>
           </w:p>
         </w:tc>
@@ -1922,7 +1922,7 @@
                 <w:szCs w:val="18"/>
                 <w:shd w:fill="F1F5F9" w:color="auto" w:val="clear"/>
               </w:rPr>
-              <w:t xml:space="preserve">logo/lockup/resale-lockup-header-{28,32,36,40,44}(-dark).svg</w:t>
+              <w:t xml:space="preserve">logo/lockup/resale-lockup-header-{28,32,36,40,42,44,48}(-dark).svg</w:t>
             </w:r>
             <w:r>
               <w:rPr>
@@ -3166,7 +3166,645 @@
         <w:t xml:space="preserve">shape-rendering="crispEdges"</w:t>
       </w:r>
       <w:r>
-        <w:t xml:space="preserve">. Native apps use the @2x/@3x PNGs at the matching point size. In live web UI the lockup may be built in HTML/CSS only if it matches this construction exactly; the reference implementation is the </w:t>
+        <w:t xml:space="preserve">. Native apps use the @2x/@3x PNGs at the matching point size.</w:t>
+      </w:r>
+    </w:p>
+    <w:p>
+      <w:r>
+        <w:t xml:space="preserve">Width caps: </w:t>
+      </w:r>
+      <w:r>
+        <w:rPr>
+          <w:rFonts w:ascii="Consolas" w:cs="Consolas" w:eastAsia="Consolas" w:hAnsi="Consolas"/>
+          <w:sz w:val="18"/>
+          <w:szCs w:val="18"/>
+          <w:shd w:fill="F1F5F9" w:color="auto" w:val="clear"/>
+        </w:rPr>
+        <w:t xml:space="preserve">header-36</w:t>
+      </w:r>
+      <w:r>
+        <w:t xml:space="preserve"> is at most </w:t>
+      </w:r>
+      <w:r>
+        <w:rPr>
+          <w:b/>
+          <w:bCs/>
+        </w:rPr>
+        <w:t xml:space="preserve">180px</w:t>
+      </w:r>
+      <w:r>
+        <w:t xml:space="preserve"> wide and </w:t>
+      </w:r>
+      <w:r>
+        <w:rPr>
+          <w:rFonts w:ascii="Consolas" w:cs="Consolas" w:eastAsia="Consolas" w:hAnsi="Consolas"/>
+          <w:sz w:val="18"/>
+          <w:szCs w:val="18"/>
+          <w:shd w:fill="F1F5F9" w:color="auto" w:val="clear"/>
+        </w:rPr>
+        <w:t xml:space="preserve">header-28</w:t>
+      </w:r>
+      <w:r>
+        <w:t xml:space="preserve"> at most </w:t>
+      </w:r>
+      <w:r>
+        <w:rPr>
+          <w:b/>
+          <w:bCs/>
+        </w:rPr>
+        <w:t xml:space="preserve">140px</w:t>
+      </w:r>
+      <w:r>
+        <w:t xml:space="preserve">, so the lockup fits beside three 44px buttons on phones (screen width − 180px). To meet the cap, the symbol gap and name letter-spacing are tightened slightly; nothing else changes.</w:t>
+      </w:r>
+    </w:p>
+    <w:tbl>
+      <w:tblPr>
+        <w:tblW w:type="dxa" w:w="9840"/>
+        <w:tblBorders>
+          <w:top w:val="single" w:color="auto" w:sz="4"/>
+          <w:left w:val="single" w:color="auto" w:sz="4"/>
+          <w:bottom w:val="single" w:color="auto" w:sz="4"/>
+          <w:right w:val="single" w:color="auto" w:sz="4"/>
+          <w:insideH w:val="single" w:color="auto" w:sz="4"/>
+          <w:insideV w:val="single" w:color="auto" w:sz="4"/>
+        </w:tblBorders>
+      </w:tblPr>
+      <w:tblGrid>
+        <w:gridCol w:w="2952"/>
+        <w:gridCol w:w="6888"/>
+      </w:tblGrid>
+      <w:tr>
+        <w:trPr>
+          <w:tblHeader/>
+        </w:trPr>
+        <w:tc>
+          <w:tcPr>
+            <w:tcW w:type="dxa" w:w="2952"/>
+            <w:tcBorders>
+              <w:top w:val="single" w:color="E2E8F0" w:sz="4"/>
+              <w:left w:val="single" w:color="E2E8F0" w:sz="4"/>
+              <w:bottom w:val="single" w:color="E2E8F0" w:sz="4"/>
+              <w:right w:val="single" w:color="E2E8F0" w:sz="4"/>
+            </w:tcBorders>
+            <w:shd w:fill="F1F5F9" w:color="auto" w:val="clear"/>
+            <w:tcMar>
+              <w:top w:type="dxa" w:w="60"/>
+              <w:left w:type="dxa" w:w="100"/>
+              <w:bottom w:type="dxa" w:w="60"/>
+              <w:right w:type="dxa" w:w="100"/>
+            </w:tcMar>
+          </w:tcPr>
+          <w:p>
+            <w:pPr>
+              <w:spacing w:after="0" w:before="0"/>
+            </w:pPr>
+            <w:r>
+              <w:rPr>
+                <w:b/>
+                <w:bCs/>
+                <w:color w:val="64748B"/>
+                <w:sz w:val="18"/>
+                <w:szCs w:val="18"/>
+              </w:rPr>
+              <w:t xml:space="preserve">Header file</w:t>
+            </w:r>
+          </w:p>
+        </w:tc>
+        <w:tc>
+          <w:tcPr>
+            <w:tcW w:type="dxa" w:w="6888"/>
+            <w:tcBorders>
+              <w:top w:val="single" w:color="E2E8F0" w:sz="4"/>
+              <w:left w:val="single" w:color="E2E8F0" w:sz="4"/>
+              <w:bottom w:val="single" w:color="E2E8F0" w:sz="4"/>
+              <w:right w:val="single" w:color="E2E8F0" w:sz="4"/>
+            </w:tcBorders>
+            <w:shd w:fill="F1F5F9" w:color="auto" w:val="clear"/>
+            <w:tcMar>
+              <w:top w:type="dxa" w:w="60"/>
+              <w:left w:type="dxa" w:w="100"/>
+              <w:bottom w:type="dxa" w:w="60"/>
+              <w:right w:type="dxa" w:w="100"/>
+            </w:tcMar>
+          </w:tcPr>
+          <w:p>
+            <w:pPr>
+              <w:spacing w:after="0" w:before="0"/>
+            </w:pPr>
+            <w:r>
+              <w:rPr>
+                <w:b/>
+                <w:bCs/>
+                <w:color w:val="64748B"/>
+                <w:sz w:val="18"/>
+                <w:szCs w:val="18"/>
+              </w:rPr>
+              <w:t xml:space="preserve">Size (W × H)</w:t>
+            </w:r>
+          </w:p>
+        </w:tc>
+      </w:tr>
+      <w:tr>
+        <w:trPr>
+          <w:tblHeader w:val="off"/>
+        </w:trPr>
+        <w:tc>
+          <w:tcPr>
+            <w:tcW w:type="dxa" w:w="2952"/>
+            <w:tcBorders>
+              <w:top w:val="single" w:color="E2E8F0" w:sz="4"/>
+              <w:left w:val="single" w:color="E2E8F0" w:sz="4"/>
+              <w:bottom w:val="single" w:color="E2E8F0" w:sz="4"/>
+              <w:right w:val="single" w:color="E2E8F0" w:sz="4"/>
+            </w:tcBorders>
+            <w:tcMar>
+              <w:top w:type="dxa" w:w="60"/>
+              <w:left w:type="dxa" w:w="100"/>
+              <w:bottom w:type="dxa" w:w="60"/>
+              <w:right w:type="dxa" w:w="100"/>
+            </w:tcMar>
+          </w:tcPr>
+          <w:p>
+            <w:pPr>
+              <w:spacing w:after="0" w:before="0"/>
+            </w:pPr>
+            <w:r>
+              <w:rPr>
+                <w:rFonts w:ascii="Consolas" w:cs="Consolas" w:eastAsia="Consolas" w:hAnsi="Consolas"/>
+                <w:sz w:val="18"/>
+                <w:szCs w:val="18"/>
+                <w:shd w:fill="F1F5F9" w:color="auto" w:val="clear"/>
+              </w:rPr>
+              <w:t xml:space="preserve">header-28</w:t>
+            </w:r>
+          </w:p>
+        </w:tc>
+        <w:tc>
+          <w:tcPr>
+            <w:tcW w:type="dxa" w:w="6888"/>
+            <w:tcBorders>
+              <w:top w:val="single" w:color="E2E8F0" w:sz="4"/>
+              <w:left w:val="single" w:color="E2E8F0" w:sz="4"/>
+              <w:bottom w:val="single" w:color="E2E8F0" w:sz="4"/>
+              <w:right w:val="single" w:color="E2E8F0" w:sz="4"/>
+            </w:tcBorders>
+            <w:tcMar>
+              <w:top w:type="dxa" w:w="60"/>
+              <w:left w:type="dxa" w:w="100"/>
+              <w:bottom w:type="dxa" w:w="60"/>
+              <w:right w:type="dxa" w:w="100"/>
+            </w:tcMar>
+          </w:tcPr>
+          <w:p>
+            <w:pPr>
+              <w:spacing w:after="0" w:before="0"/>
+            </w:pPr>
+            <w:r>
+              <w:rPr>
+                <w:sz w:val="19"/>
+                <w:szCs w:val="19"/>
+              </w:rPr>
+              <w:t xml:space="preserve">140 × 28</w:t>
+            </w:r>
+          </w:p>
+        </w:tc>
+      </w:tr>
+      <w:tr>
+        <w:trPr>
+          <w:tblHeader w:val="off"/>
+        </w:trPr>
+        <w:tc>
+          <w:tcPr>
+            <w:tcW w:type="dxa" w:w="2952"/>
+            <w:tcBorders>
+              <w:top w:val="single" w:color="E2E8F0" w:sz="4"/>
+              <w:left w:val="single" w:color="E2E8F0" w:sz="4"/>
+              <w:bottom w:val="single" w:color="E2E8F0" w:sz="4"/>
+              <w:right w:val="single" w:color="E2E8F0" w:sz="4"/>
+            </w:tcBorders>
+            <w:tcMar>
+              <w:top w:type="dxa" w:w="60"/>
+              <w:left w:type="dxa" w:w="100"/>
+              <w:bottom w:type="dxa" w:w="60"/>
+              <w:right w:type="dxa" w:w="100"/>
+            </w:tcMar>
+          </w:tcPr>
+          <w:p>
+            <w:pPr>
+              <w:spacing w:after="0" w:before="0"/>
+            </w:pPr>
+            <w:r>
+              <w:rPr>
+                <w:rFonts w:ascii="Consolas" w:cs="Consolas" w:eastAsia="Consolas" w:hAnsi="Consolas"/>
+                <w:sz w:val="18"/>
+                <w:szCs w:val="18"/>
+                <w:shd w:fill="F1F5F9" w:color="auto" w:val="clear"/>
+              </w:rPr>
+              <w:t xml:space="preserve">header-32</w:t>
+            </w:r>
+          </w:p>
+        </w:tc>
+        <w:tc>
+          <w:tcPr>
+            <w:tcW w:type="dxa" w:w="6888"/>
+            <w:tcBorders>
+              <w:top w:val="single" w:color="E2E8F0" w:sz="4"/>
+              <w:left w:val="single" w:color="E2E8F0" w:sz="4"/>
+              <w:bottom w:val="single" w:color="E2E8F0" w:sz="4"/>
+              <w:right w:val="single" w:color="E2E8F0" w:sz="4"/>
+            </w:tcBorders>
+            <w:tcMar>
+              <w:top w:type="dxa" w:w="60"/>
+              <w:left w:type="dxa" w:w="100"/>
+              <w:bottom w:type="dxa" w:w="60"/>
+              <w:right w:type="dxa" w:w="100"/>
+            </w:tcMar>
+          </w:tcPr>
+          <w:p>
+            <w:pPr>
+              <w:spacing w:after="0" w:before="0"/>
+            </w:pPr>
+            <w:r>
+              <w:rPr>
+                <w:sz w:val="19"/>
+                <w:szCs w:val="19"/>
+              </w:rPr>
+              <w:t xml:space="preserve">161 × 32</w:t>
+            </w:r>
+          </w:p>
+        </w:tc>
+      </w:tr>
+      <w:tr>
+        <w:trPr>
+          <w:tblHeader w:val="off"/>
+        </w:trPr>
+        <w:tc>
+          <w:tcPr>
+            <w:tcW w:type="dxa" w:w="2952"/>
+            <w:tcBorders>
+              <w:top w:val="single" w:color="E2E8F0" w:sz="4"/>
+              <w:left w:val="single" w:color="E2E8F0" w:sz="4"/>
+              <w:bottom w:val="single" w:color="E2E8F0" w:sz="4"/>
+              <w:right w:val="single" w:color="E2E8F0" w:sz="4"/>
+            </w:tcBorders>
+            <w:tcMar>
+              <w:top w:type="dxa" w:w="60"/>
+              <w:left w:type="dxa" w:w="100"/>
+              <w:bottom w:type="dxa" w:w="60"/>
+              <w:right w:type="dxa" w:w="100"/>
+            </w:tcMar>
+          </w:tcPr>
+          <w:p>
+            <w:pPr>
+              <w:spacing w:after="0" w:before="0"/>
+            </w:pPr>
+            <w:r>
+              <w:rPr>
+                <w:rFonts w:ascii="Consolas" w:cs="Consolas" w:eastAsia="Consolas" w:hAnsi="Consolas"/>
+                <w:sz w:val="18"/>
+                <w:szCs w:val="18"/>
+                <w:shd w:fill="F1F5F9" w:color="auto" w:val="clear"/>
+              </w:rPr>
+              <w:t xml:space="preserve">header-36</w:t>
+            </w:r>
+          </w:p>
+        </w:tc>
+        <w:tc>
+          <w:tcPr>
+            <w:tcW w:type="dxa" w:w="6888"/>
+            <w:tcBorders>
+              <w:top w:val="single" w:color="E2E8F0" w:sz="4"/>
+              <w:left w:val="single" w:color="E2E8F0" w:sz="4"/>
+              <w:bottom w:val="single" w:color="E2E8F0" w:sz="4"/>
+              <w:right w:val="single" w:color="E2E8F0" w:sz="4"/>
+            </w:tcBorders>
+            <w:tcMar>
+              <w:top w:type="dxa" w:w="60"/>
+              <w:left w:type="dxa" w:w="100"/>
+              <w:bottom w:type="dxa" w:w="60"/>
+              <w:right w:type="dxa" w:w="100"/>
+            </w:tcMar>
+          </w:tcPr>
+          <w:p>
+            <w:pPr>
+              <w:spacing w:after="0" w:before="0"/>
+            </w:pPr>
+            <w:r>
+              <w:rPr>
+                <w:sz w:val="19"/>
+                <w:szCs w:val="19"/>
+              </w:rPr>
+              <w:t xml:space="preserve">180 × 36</w:t>
+            </w:r>
+          </w:p>
+        </w:tc>
+      </w:tr>
+      <w:tr>
+        <w:trPr>
+          <w:tblHeader w:val="off"/>
+        </w:trPr>
+        <w:tc>
+          <w:tcPr>
+            <w:tcW w:type="dxa" w:w="2952"/>
+            <w:tcBorders>
+              <w:top w:val="single" w:color="E2E8F0" w:sz="4"/>
+              <w:left w:val="single" w:color="E2E8F0" w:sz="4"/>
+              <w:bottom w:val="single" w:color="E2E8F0" w:sz="4"/>
+              <w:right w:val="single" w:color="E2E8F0" w:sz="4"/>
+            </w:tcBorders>
+            <w:tcMar>
+              <w:top w:type="dxa" w:w="60"/>
+              <w:left w:type="dxa" w:w="100"/>
+              <w:bottom w:type="dxa" w:w="60"/>
+              <w:right w:type="dxa" w:w="100"/>
+            </w:tcMar>
+          </w:tcPr>
+          <w:p>
+            <w:pPr>
+              <w:spacing w:after="0" w:before="0"/>
+            </w:pPr>
+            <w:r>
+              <w:rPr>
+                <w:rFonts w:ascii="Consolas" w:cs="Consolas" w:eastAsia="Consolas" w:hAnsi="Consolas"/>
+                <w:sz w:val="18"/>
+                <w:szCs w:val="18"/>
+                <w:shd w:fill="F1F5F9" w:color="auto" w:val="clear"/>
+              </w:rPr>
+              <w:t xml:space="preserve">header-40</w:t>
+            </w:r>
+          </w:p>
+        </w:tc>
+        <w:tc>
+          <w:tcPr>
+            <w:tcW w:type="dxa" w:w="6888"/>
+            <w:tcBorders>
+              <w:top w:val="single" w:color="E2E8F0" w:sz="4"/>
+              <w:left w:val="single" w:color="E2E8F0" w:sz="4"/>
+              <w:bottom w:val="single" w:color="E2E8F0" w:sz="4"/>
+              <w:right w:val="single" w:color="E2E8F0" w:sz="4"/>
+            </w:tcBorders>
+            <w:tcMar>
+              <w:top w:type="dxa" w:w="60"/>
+              <w:left w:type="dxa" w:w="100"/>
+              <w:bottom w:type="dxa" w:w="60"/>
+              <w:right w:type="dxa" w:w="100"/>
+            </w:tcMar>
+          </w:tcPr>
+          <w:p>
+            <w:pPr>
+              <w:spacing w:after="0" w:before="0"/>
+            </w:pPr>
+            <w:r>
+              <w:rPr>
+                <w:sz w:val="19"/>
+                <w:szCs w:val="19"/>
+              </w:rPr>
+              <w:t xml:space="preserve">203 × 40</w:t>
+            </w:r>
+          </w:p>
+        </w:tc>
+      </w:tr>
+      <w:tr>
+        <w:trPr>
+          <w:tblHeader w:val="off"/>
+        </w:trPr>
+        <w:tc>
+          <w:tcPr>
+            <w:tcW w:type="dxa" w:w="2952"/>
+            <w:tcBorders>
+              <w:top w:val="single" w:color="E2E8F0" w:sz="4"/>
+              <w:left w:val="single" w:color="E2E8F0" w:sz="4"/>
+              <w:bottom w:val="single" w:color="E2E8F0" w:sz="4"/>
+              <w:right w:val="single" w:color="E2E8F0" w:sz="4"/>
+            </w:tcBorders>
+            <w:tcMar>
+              <w:top w:type="dxa" w:w="60"/>
+              <w:left w:type="dxa" w:w="100"/>
+              <w:bottom w:type="dxa" w:w="60"/>
+              <w:right w:type="dxa" w:w="100"/>
+            </w:tcMar>
+          </w:tcPr>
+          <w:p>
+            <w:pPr>
+              <w:spacing w:after="0" w:before="0"/>
+            </w:pPr>
+            <w:r>
+              <w:rPr>
+                <w:rFonts w:ascii="Consolas" w:cs="Consolas" w:eastAsia="Consolas" w:hAnsi="Consolas"/>
+                <w:sz w:val="18"/>
+                <w:szCs w:val="18"/>
+                <w:shd w:fill="F1F5F9" w:color="auto" w:val="clear"/>
+              </w:rPr>
+              <w:t xml:space="preserve">header-42</w:t>
+            </w:r>
+          </w:p>
+        </w:tc>
+        <w:tc>
+          <w:tcPr>
+            <w:tcW w:type="dxa" w:w="6888"/>
+            <w:tcBorders>
+              <w:top w:val="single" w:color="E2E8F0" w:sz="4"/>
+              <w:left w:val="single" w:color="E2E8F0" w:sz="4"/>
+              <w:bottom w:val="single" w:color="E2E8F0" w:sz="4"/>
+              <w:right w:val="single" w:color="E2E8F0" w:sz="4"/>
+            </w:tcBorders>
+            <w:tcMar>
+              <w:top w:type="dxa" w:w="60"/>
+              <w:left w:type="dxa" w:w="100"/>
+              <w:bottom w:type="dxa" w:w="60"/>
+              <w:right w:type="dxa" w:w="100"/>
+            </w:tcMar>
+          </w:tcPr>
+          <w:p>
+            <w:pPr>
+              <w:spacing w:after="0" w:before="0"/>
+            </w:pPr>
+            <w:r>
+              <w:rPr>
+                <w:sz w:val="19"/>
+                <w:szCs w:val="19"/>
+              </w:rPr>
+              <w:t xml:space="preserve">212 × 42</w:t>
+            </w:r>
+          </w:p>
+        </w:tc>
+      </w:tr>
+      <w:tr>
+        <w:trPr>
+          <w:tblHeader w:val="off"/>
+        </w:trPr>
+        <w:tc>
+          <w:tcPr>
+            <w:tcW w:type="dxa" w:w="2952"/>
+            <w:tcBorders>
+              <w:top w:val="single" w:color="E2E8F0" w:sz="4"/>
+              <w:left w:val="single" w:color="E2E8F0" w:sz="4"/>
+              <w:bottom w:val="single" w:color="E2E8F0" w:sz="4"/>
+              <w:right w:val="single" w:color="E2E8F0" w:sz="4"/>
+            </w:tcBorders>
+            <w:tcMar>
+              <w:top w:type="dxa" w:w="60"/>
+              <w:left w:type="dxa" w:w="100"/>
+              <w:bottom w:type="dxa" w:w="60"/>
+              <w:right w:type="dxa" w:w="100"/>
+            </w:tcMar>
+          </w:tcPr>
+          <w:p>
+            <w:pPr>
+              <w:spacing w:after="0" w:before="0"/>
+            </w:pPr>
+            <w:r>
+              <w:rPr>
+                <w:rFonts w:ascii="Consolas" w:cs="Consolas" w:eastAsia="Consolas" w:hAnsi="Consolas"/>
+                <w:sz w:val="18"/>
+                <w:szCs w:val="18"/>
+                <w:shd w:fill="F1F5F9" w:color="auto" w:val="clear"/>
+              </w:rPr>
+              <w:t xml:space="preserve">header-44</w:t>
+            </w:r>
+          </w:p>
+        </w:tc>
+        <w:tc>
+          <w:tcPr>
+            <w:tcW w:type="dxa" w:w="6888"/>
+            <w:tcBorders>
+              <w:top w:val="single" w:color="E2E8F0" w:sz="4"/>
+              <w:left w:val="single" w:color="E2E8F0" w:sz="4"/>
+              <w:bottom w:val="single" w:color="E2E8F0" w:sz="4"/>
+              <w:right w:val="single" w:color="E2E8F0" w:sz="4"/>
+            </w:tcBorders>
+            <w:tcMar>
+              <w:top w:type="dxa" w:w="60"/>
+              <w:left w:type="dxa" w:w="100"/>
+              <w:bottom w:type="dxa" w:w="60"/>
+              <w:right w:type="dxa" w:w="100"/>
+            </w:tcMar>
+          </w:tcPr>
+          <w:p>
+            <w:pPr>
+              <w:spacing w:after="0" w:before="0"/>
+            </w:pPr>
+            <w:r>
+              <w:rPr>
+                <w:sz w:val="19"/>
+                <w:szCs w:val="19"/>
+              </w:rPr>
+              <w:t xml:space="preserve">223 × 44</w:t>
+            </w:r>
+          </w:p>
+        </w:tc>
+      </w:tr>
+      <w:tr>
+        <w:trPr>
+          <w:tblHeader w:val="off"/>
+        </w:trPr>
+        <w:tc>
+          <w:tcPr>
+            <w:tcW w:type="dxa" w:w="2952"/>
+            <w:tcBorders>
+              <w:top w:val="single" w:color="E2E8F0" w:sz="4"/>
+              <w:left w:val="single" w:color="E2E8F0" w:sz="4"/>
+              <w:bottom w:val="single" w:color="E2E8F0" w:sz="4"/>
+              <w:right w:val="single" w:color="E2E8F0" w:sz="4"/>
+            </w:tcBorders>
+            <w:tcMar>
+              <w:top w:type="dxa" w:w="60"/>
+              <w:left w:type="dxa" w:w="100"/>
+              <w:bottom w:type="dxa" w:w="60"/>
+              <w:right w:type="dxa" w:w="100"/>
+            </w:tcMar>
+          </w:tcPr>
+          <w:p>
+            <w:pPr>
+              <w:spacing w:after="0" w:before="0"/>
+            </w:pPr>
+            <w:r>
+              <w:rPr>
+                <w:rFonts w:ascii="Consolas" w:cs="Consolas" w:eastAsia="Consolas" w:hAnsi="Consolas"/>
+                <w:sz w:val="18"/>
+                <w:szCs w:val="18"/>
+                <w:shd w:fill="F1F5F9" w:color="auto" w:val="clear"/>
+              </w:rPr>
+              <w:t xml:space="preserve">header-48</w:t>
+            </w:r>
+          </w:p>
+        </w:tc>
+        <w:tc>
+          <w:tcPr>
+            <w:tcW w:type="dxa" w:w="6888"/>
+            <w:tcBorders>
+              <w:top w:val="single" w:color="E2E8F0" w:sz="4"/>
+              <w:left w:val="single" w:color="E2E8F0" w:sz="4"/>
+              <w:bottom w:val="single" w:color="E2E8F0" w:sz="4"/>
+              <w:right w:val="single" w:color="E2E8F0" w:sz="4"/>
+            </w:tcBorders>
+            <w:tcMar>
+              <w:top w:type="dxa" w:w="60"/>
+              <w:left w:type="dxa" w:w="100"/>
+              <w:bottom w:type="dxa" w:w="60"/>
+              <w:right w:type="dxa" w:w="100"/>
+            </w:tcMar>
+          </w:tcPr>
+          <w:p>
+            <w:pPr>
+              <w:spacing w:after="0" w:before="0"/>
+            </w:pPr>
+            <w:r>
+              <w:rPr>
+                <w:sz w:val="19"/>
+                <w:szCs w:val="19"/>
+              </w:rPr>
+              <w:t xml:space="preserve">243 × 48</w:t>
+            </w:r>
+          </w:p>
+        </w:tc>
+      </w:tr>
+    </w:tbl>
+    <w:p>
+      <w:pPr>
+        <w:spacing w:after="60"/>
+      </w:pPr>
+    </w:p>
+    <w:p>
+      <w:r>
+        <w:t xml:space="preserve">Email cannot use SVG: use </w:t>
+      </w:r>
+      <w:r>
+        <w:rPr>
+          <w:rFonts w:ascii="Consolas" w:cs="Consolas" w:eastAsia="Consolas" w:hAnsi="Consolas"/>
+          <w:sz w:val="18"/>
+          <w:szCs w:val="18"/>
+          <w:shd w:fill="F1F5F9" w:color="auto" w:val="clear"/>
+        </w:rPr>
+        <w:t xml:space="preserve">resale-lockup-header-42@2x.png</w:t>
+      </w:r>
+      <w:r>
+        <w:t xml:space="preserve"> (or </w:t>
+      </w:r>
+      <w:r>
+        <w:rPr>
+          <w:rFonts w:ascii="Consolas" w:cs="Consolas" w:eastAsia="Consolas" w:hAnsi="Consolas"/>
+          <w:sz w:val="18"/>
+          <w:szCs w:val="18"/>
+          <w:shd w:fill="F1F5F9" w:color="auto" w:val="clear"/>
+        </w:rPr>
+        <w:t xml:space="preserve">@3x</w:t>
+      </w:r>
+      <w:r>
+        <w:t xml:space="preserve">) displayed at 212 × 42, on a white header. The PNGs are transparent; do not place them on dark email backgrounds (use the </w:t>
+      </w:r>
+      <w:r>
+        <w:rPr>
+          <w:rFonts w:ascii="Consolas" w:cs="Consolas" w:eastAsia="Consolas" w:hAnsi="Consolas"/>
+          <w:sz w:val="18"/>
+          <w:szCs w:val="18"/>
+          <w:shd w:fill="F1F5F9" w:color="auto" w:val="clear"/>
+        </w:rPr>
+        <w:t xml:space="preserve">-dark</w:t>
+      </w:r>
+      <w:r>
+        <w:t xml:space="preserve"> PNG there). In live web UI the lockup may be built in HTML/CSS only if it matches this construction exactly; the reference implementation is the </w:t>
       </w:r>
       <w:r>
         <w:rPr>
@@ -15729,7 +16367,7 @@
                 <w:szCs w:val="18"/>
                 <w:shd w:fill="F1F5F9" w:color="auto" w:val="clear"/>
               </w:rPr>
-              <w:t xml:space="preserve">22–24px</w:t>
+              <w:t xml:space="preserve">23–26px</w:t>
             </w:r>
           </w:p>
         </w:tc>
@@ -15753,22 +16391,6 @@
             <w:pPr>
               <w:spacing w:after="0" w:before="0"/>
             </w:pPr>
-            <w:r>
-              <w:rPr>
-                <w:rFonts w:ascii="Consolas" w:cs="Consolas" w:eastAsia="Consolas" w:hAnsi="Consolas"/>
-                <w:sz w:val="18"/>
-                <w:szCs w:val="18"/>
-                <w:shd w:fill="F1F5F9" w:color="auto" w:val="clear"/>
-              </w:rPr>
-              <w:t xml:space="preserve">36–40px</w:t>
-            </w:r>
-            <w:r>
-              <w:rPr>
-                <w:sz w:val="19"/>
-                <w:szCs w:val="19"/>
-              </w:rPr>
-              <w:t xml:space="preserve">: </w:t>
-            </w:r>
             <w:r>
               <w:rPr>
                 <w:rFonts w:ascii="Consolas" w:cs="Consolas" w:eastAsia="Consolas" w:hAnsi="Consolas"/>
@@ -15888,22 +16510,6 @@
                 <w:szCs w:val="18"/>
                 <w:shd w:fill="F1F5F9" w:color="auto" w:val="clear"/>
               </w:rPr>
-              <w:t xml:space="preserve">28–32px</w:t>
-            </w:r>
-            <w:r>
-              <w:rPr>
-                <w:sz w:val="19"/>
-                <w:szCs w:val="19"/>
-              </w:rPr>
-              <w:t xml:space="preserve">: </w:t>
-            </w:r>
-            <w:r>
-              <w:rPr>
-                <w:rFonts w:ascii="Consolas" w:cs="Consolas" w:eastAsia="Consolas" w:hAnsi="Consolas"/>
-                <w:sz w:val="18"/>
-                <w:szCs w:val="18"/>
-                <w:shd w:fill="F1F5F9" w:color="auto" w:val="clear"/>
-              </w:rPr>
               <w:t xml:space="preserve">resale-lockup-header-28</w:t>
             </w:r>
             <w:r>
@@ -15954,7 +16560,7 @@
                 <w:sz w:val="19"/>
                 <w:szCs w:val="19"/>
               </w:rPr>
-              <w:t xml:space="preserve">Mobile header and app bar</w:t>
+              <w:t xml:space="preserve">Phones 360–639px wide</w:t>
             </w:r>
           </w:p>
         </w:tc>
@@ -15985,7 +16591,7 @@
                 <w:szCs w:val="18"/>
                 <w:shd w:fill="F1F5F9" w:color="auto" w:val="clear"/>
               </w:rPr>
-              <w:t xml:space="preserve">18–21px</w:t>
+              <w:t xml:space="preserve">23px</w:t>
             </w:r>
           </w:p>
         </w:tc>
@@ -16016,15 +16622,102 @@
                 <w:szCs w:val="18"/>
                 <w:shd w:fill="F1F5F9" w:color="auto" w:val="clear"/>
               </w:rPr>
-              <w:t xml:space="preserve">28–32px</w:t>
-            </w:r>
-            <w:r>
-              <w:rPr>
-                <w:sz w:val="19"/>
-                <w:szCs w:val="19"/>
-              </w:rPr>
-              <w:t xml:space="preserve">: </w:t>
-            </w:r>
+              <w:t xml:space="preserve">resale-lockup-header-36</w:t>
+            </w:r>
+            <w:r>
+              <w:rPr>
+                <w:sz w:val="19"/>
+                <w:szCs w:val="19"/>
+              </w:rPr>
+              <w:t xml:space="preserve"> (180px wide)</w:t>
+            </w:r>
+          </w:p>
+        </w:tc>
+      </w:tr>
+      <w:tr>
+        <w:trPr>
+          <w:tblHeader w:val="off"/>
+        </w:trPr>
+        <w:tc>
+          <w:tcPr>
+            <w:tcW w:type="dxa" w:w="3280"/>
+            <w:tcBorders>
+              <w:top w:val="single" w:color="E2E8F0" w:sz="4"/>
+              <w:left w:val="single" w:color="E2E8F0" w:sz="4"/>
+              <w:bottom w:val="single" w:color="E2E8F0" w:sz="4"/>
+              <w:right w:val="single" w:color="E2E8F0" w:sz="4"/>
+            </w:tcBorders>
+            <w:tcMar>
+              <w:top w:type="dxa" w:w="60"/>
+              <w:left w:type="dxa" w:w="100"/>
+              <w:bottom w:type="dxa" w:w="60"/>
+              <w:right w:type="dxa" w:w="100"/>
+            </w:tcMar>
+          </w:tcPr>
+          <w:p>
+            <w:pPr>
+              <w:spacing w:after="0" w:before="0"/>
+            </w:pPr>
+            <w:r>
+              <w:rPr>
+                <w:sz w:val="19"/>
+                <w:szCs w:val="19"/>
+              </w:rPr>
+              <w:t xml:space="preserve">Phones 320–359px wide</w:t>
+            </w:r>
+          </w:p>
+        </w:tc>
+        <w:tc>
+          <w:tcPr>
+            <w:tcW w:type="dxa" w:w="3280"/>
+            <w:tcBorders>
+              <w:top w:val="single" w:color="E2E8F0" w:sz="4"/>
+              <w:left w:val="single" w:color="E2E8F0" w:sz="4"/>
+              <w:bottom w:val="single" w:color="E2E8F0" w:sz="4"/>
+              <w:right w:val="single" w:color="E2E8F0" w:sz="4"/>
+            </w:tcBorders>
+            <w:tcMar>
+              <w:top w:type="dxa" w:w="60"/>
+              <w:left w:type="dxa" w:w="100"/>
+              <w:bottom w:type="dxa" w:w="60"/>
+              <w:right w:type="dxa" w:w="100"/>
+            </w:tcMar>
+          </w:tcPr>
+          <w:p>
+            <w:pPr>
+              <w:spacing w:after="0" w:before="0"/>
+            </w:pPr>
+            <w:r>
+              <w:rPr>
+                <w:rFonts w:ascii="Consolas" w:cs="Consolas" w:eastAsia="Consolas" w:hAnsi="Consolas"/>
+                <w:sz w:val="18"/>
+                <w:szCs w:val="18"/>
+                <w:shd w:fill="F1F5F9" w:color="auto" w:val="clear"/>
+              </w:rPr>
+              <w:t xml:space="preserve">18px</w:t>
+            </w:r>
+          </w:p>
+        </w:tc>
+        <w:tc>
+          <w:tcPr>
+            <w:tcW w:type="dxa" w:w="3280"/>
+            <w:tcBorders>
+              <w:top w:val="single" w:color="E2E8F0" w:sz="4"/>
+              <w:left w:val="single" w:color="E2E8F0" w:sz="4"/>
+              <w:bottom w:val="single" w:color="E2E8F0" w:sz="4"/>
+              <w:right w:val="single" w:color="E2E8F0" w:sz="4"/>
+            </w:tcBorders>
+            <w:tcMar>
+              <w:top w:type="dxa" w:w="60"/>
+              <w:left w:type="dxa" w:w="100"/>
+              <w:bottom w:type="dxa" w:w="60"/>
+              <w:right w:type="dxa" w:w="100"/>
+            </w:tcMar>
+          </w:tcPr>
+          <w:p>
+            <w:pPr>
+              <w:spacing w:after="0" w:before="0"/>
+            </w:pPr>
             <w:r>
               <w:rPr>
                 <w:rFonts w:ascii="Consolas" w:cs="Consolas" w:eastAsia="Consolas" w:hAnsi="Consolas"/>
@@ -16039,16 +16732,206 @@
                 <w:sz w:val="19"/>
                 <w:szCs w:val="19"/>
               </w:rPr>
-              <w:t xml:space="preserve"> or </w:t>
-            </w:r>
-            <w:r>
-              <w:rPr>
-                <w:rFonts w:ascii="Consolas" w:cs="Consolas" w:eastAsia="Consolas" w:hAnsi="Consolas"/>
-                <w:sz w:val="18"/>
-                <w:szCs w:val="18"/>
-                <w:shd w:fill="F1F5F9" w:color="auto" w:val="clear"/>
-              </w:rPr>
-              <w:t xml:space="preserve">-32</w:t>
+              <w:t xml:space="preserve"> (140px wide). Keep the full lockup; do not drop to the symbol alone, because ".com.pk" must stay visible.</w:t>
+            </w:r>
+          </w:p>
+        </w:tc>
+      </w:tr>
+      <w:tr>
+        <w:trPr>
+          <w:tblHeader w:val="off"/>
+        </w:trPr>
+        <w:tc>
+          <w:tcPr>
+            <w:tcW w:type="dxa" w:w="3280"/>
+            <w:tcBorders>
+              <w:top w:val="single" w:color="E2E8F0" w:sz="4"/>
+              <w:left w:val="single" w:color="E2E8F0" w:sz="4"/>
+              <w:bottom w:val="single" w:color="E2E8F0" w:sz="4"/>
+              <w:right w:val="single" w:color="E2E8F0" w:sz="4"/>
+            </w:tcBorders>
+            <w:tcMar>
+              <w:top w:type="dxa" w:w="60"/>
+              <w:left w:type="dxa" w:w="100"/>
+              <w:bottom w:type="dxa" w:w="60"/>
+              <w:right w:type="dxa" w:w="100"/>
+            </w:tcMar>
+          </w:tcPr>
+          <w:p>
+            <w:pPr>
+              <w:spacing w:after="0" w:before="0"/>
+            </w:pPr>
+            <w:r>
+              <w:rPr>
+                <w:sz w:val="19"/>
+                <w:szCs w:val="19"/>
+              </w:rPr>
+              <w:t xml:space="preserve">Login / account page</w:t>
+            </w:r>
+          </w:p>
+        </w:tc>
+        <w:tc>
+          <w:tcPr>
+            <w:tcW w:type="dxa" w:w="3280"/>
+            <w:tcBorders>
+              <w:top w:val="single" w:color="E2E8F0" w:sz="4"/>
+              <w:left w:val="single" w:color="E2E8F0" w:sz="4"/>
+              <w:bottom w:val="single" w:color="E2E8F0" w:sz="4"/>
+              <w:right w:val="single" w:color="E2E8F0" w:sz="4"/>
+            </w:tcBorders>
+            <w:tcMar>
+              <w:top w:type="dxa" w:w="60"/>
+              <w:left w:type="dxa" w:w="100"/>
+              <w:bottom w:type="dxa" w:w="60"/>
+              <w:right w:type="dxa" w:w="100"/>
+            </w:tcMar>
+          </w:tcPr>
+          <w:p>
+            <w:pPr>
+              <w:spacing w:after="0" w:before="0"/>
+            </w:pPr>
+            <w:r>
+              <w:rPr>
+                <w:rFonts w:ascii="Consolas" w:cs="Consolas" w:eastAsia="Consolas" w:hAnsi="Consolas"/>
+                <w:sz w:val="18"/>
+                <w:szCs w:val="18"/>
+                <w:shd w:fill="F1F5F9" w:color="auto" w:val="clear"/>
+              </w:rPr>
+              <w:t xml:space="preserve">31px</w:t>
+            </w:r>
+          </w:p>
+        </w:tc>
+        <w:tc>
+          <w:tcPr>
+            <w:tcW w:type="dxa" w:w="3280"/>
+            <w:tcBorders>
+              <w:top w:val="single" w:color="E2E8F0" w:sz="4"/>
+              <w:left w:val="single" w:color="E2E8F0" w:sz="4"/>
+              <w:bottom w:val="single" w:color="E2E8F0" w:sz="4"/>
+              <w:right w:val="single" w:color="E2E8F0" w:sz="4"/>
+            </w:tcBorders>
+            <w:tcMar>
+              <w:top w:type="dxa" w:w="60"/>
+              <w:left w:type="dxa" w:w="100"/>
+              <w:bottom w:type="dxa" w:w="60"/>
+              <w:right w:type="dxa" w:w="100"/>
+            </w:tcMar>
+          </w:tcPr>
+          <w:p>
+            <w:pPr>
+              <w:spacing w:after="0" w:before="0"/>
+            </w:pPr>
+            <w:r>
+              <w:rPr>
+                <w:rFonts w:ascii="Consolas" w:cs="Consolas" w:eastAsia="Consolas" w:hAnsi="Consolas"/>
+                <w:sz w:val="18"/>
+                <w:szCs w:val="18"/>
+                <w:shd w:fill="F1F5F9" w:color="auto" w:val="clear"/>
+              </w:rPr>
+              <w:t xml:space="preserve">resale-lockup-header-48</w:t>
+            </w:r>
+          </w:p>
+        </w:tc>
+      </w:tr>
+      <w:tr>
+        <w:trPr>
+          <w:tblHeader w:val="off"/>
+        </w:trPr>
+        <w:tc>
+          <w:tcPr>
+            <w:tcW w:type="dxa" w:w="3280"/>
+            <w:tcBorders>
+              <w:top w:val="single" w:color="E2E8F0" w:sz="4"/>
+              <w:left w:val="single" w:color="E2E8F0" w:sz="4"/>
+              <w:bottom w:val="single" w:color="E2E8F0" w:sz="4"/>
+              <w:right w:val="single" w:color="E2E8F0" w:sz="4"/>
+            </w:tcBorders>
+            <w:tcMar>
+              <w:top w:type="dxa" w:w="60"/>
+              <w:left w:type="dxa" w:w="100"/>
+              <w:bottom w:type="dxa" w:w="60"/>
+              <w:right w:type="dxa" w:w="100"/>
+            </w:tcMar>
+          </w:tcPr>
+          <w:p>
+            <w:pPr>
+              <w:spacing w:after="0" w:before="0"/>
+            </w:pPr>
+            <w:r>
+              <w:rPr>
+                <w:sz w:val="19"/>
+                <w:szCs w:val="19"/>
+              </w:rPr>
+              <w:t xml:space="preserve">Email header</w:t>
+            </w:r>
+          </w:p>
+        </w:tc>
+        <w:tc>
+          <w:tcPr>
+            <w:tcW w:type="dxa" w:w="3280"/>
+            <w:tcBorders>
+              <w:top w:val="single" w:color="E2E8F0" w:sz="4"/>
+              <w:left w:val="single" w:color="E2E8F0" w:sz="4"/>
+              <w:bottom w:val="single" w:color="E2E8F0" w:sz="4"/>
+              <w:right w:val="single" w:color="E2E8F0" w:sz="4"/>
+            </w:tcBorders>
+            <w:tcMar>
+              <w:top w:type="dxa" w:w="60"/>
+              <w:left w:type="dxa" w:w="100"/>
+              <w:bottom w:type="dxa" w:w="60"/>
+              <w:right w:type="dxa" w:w="100"/>
+            </w:tcMar>
+          </w:tcPr>
+          <w:p>
+            <w:pPr>
+              <w:spacing w:after="0" w:before="0"/>
+            </w:pPr>
+            <w:r>
+              <w:rPr>
+                <w:rFonts w:ascii="Consolas" w:cs="Consolas" w:eastAsia="Consolas" w:hAnsi="Consolas"/>
+                <w:sz w:val="18"/>
+                <w:szCs w:val="18"/>
+                <w:shd w:fill="F1F5F9" w:color="auto" w:val="clear"/>
+              </w:rPr>
+              <w:t xml:space="preserve">27px</w:t>
+            </w:r>
+          </w:p>
+        </w:tc>
+        <w:tc>
+          <w:tcPr>
+            <w:tcW w:type="dxa" w:w="3280"/>
+            <w:tcBorders>
+              <w:top w:val="single" w:color="E2E8F0" w:sz="4"/>
+              <w:left w:val="single" w:color="E2E8F0" w:sz="4"/>
+              <w:bottom w:val="single" w:color="E2E8F0" w:sz="4"/>
+              <w:right w:val="single" w:color="E2E8F0" w:sz="4"/>
+            </w:tcBorders>
+            <w:tcMar>
+              <w:top w:type="dxa" w:w="60"/>
+              <w:left w:type="dxa" w:w="100"/>
+              <w:bottom w:type="dxa" w:w="60"/>
+              <w:right w:type="dxa" w:w="100"/>
+            </w:tcMar>
+          </w:tcPr>
+          <w:p>
+            <w:pPr>
+              <w:spacing w:after="0" w:before="0"/>
+            </w:pPr>
+            <w:r>
+              <w:rPr>
+                <w:rFonts w:ascii="Consolas" w:cs="Consolas" w:eastAsia="Consolas" w:hAnsi="Consolas"/>
+                <w:sz w:val="18"/>
+                <w:szCs w:val="18"/>
+                <w:shd w:fill="F1F5F9" w:color="auto" w:val="clear"/>
+              </w:rPr>
+              <w:t xml:space="preserve">resale-lockup-header-42@2x.png</w:t>
+            </w:r>
+            <w:r>
+              <w:rPr>
+                <w:sz w:val="19"/>
+                <w:szCs w:val="19"/>
+              </w:rPr>
+              <w:t xml:space="preserve"> at 212 × 42</w:t>
             </w:r>
           </w:p>
         </w:tc>
@@ -22574,6 +23457,194 @@
                 <w:szCs w:val="18"/>
               </w:rPr>
               <w:t xml:space="preserve">Change</w:t>
+            </w:r>
+          </w:p>
+        </w:tc>
+      </w:tr>
+      <w:tr>
+        <w:trPr>
+          <w:tblHeader w:val="off"/>
+        </w:trPr>
+        <w:tc>
+          <w:tcPr>
+            <w:tcW w:type="dxa" w:w="3280"/>
+            <w:tcBorders>
+              <w:top w:val="single" w:color="E2E8F0" w:sz="4"/>
+              <w:left w:val="single" w:color="E2E8F0" w:sz="4"/>
+              <w:bottom w:val="single" w:color="E2E8F0" w:sz="4"/>
+              <w:right w:val="single" w:color="E2E8F0" w:sz="4"/>
+            </w:tcBorders>
+            <w:tcMar>
+              <w:top w:type="dxa" w:w="60"/>
+              <w:left w:type="dxa" w:w="100"/>
+              <w:bottom w:type="dxa" w:w="60"/>
+              <w:right w:type="dxa" w:w="100"/>
+            </w:tcMar>
+          </w:tcPr>
+          <w:p>
+            <w:pPr>
+              <w:spacing w:after="0" w:before="0"/>
+            </w:pPr>
+            <w:r>
+              <w:rPr>
+                <w:sz w:val="19"/>
+                <w:szCs w:val="19"/>
+              </w:rPr>
+              <w:t xml:space="preserve">1.3</w:t>
+            </w:r>
+          </w:p>
+        </w:tc>
+        <w:tc>
+          <w:tcPr>
+            <w:tcW w:type="dxa" w:w="3280"/>
+            <w:tcBorders>
+              <w:top w:val="single" w:color="E2E8F0" w:sz="4"/>
+              <w:left w:val="single" w:color="E2E8F0" w:sz="4"/>
+              <w:bottom w:val="single" w:color="E2E8F0" w:sz="4"/>
+              <w:right w:val="single" w:color="E2E8F0" w:sz="4"/>
+            </w:tcBorders>
+            <w:tcMar>
+              <w:top w:type="dxa" w:w="60"/>
+              <w:left w:type="dxa" w:w="100"/>
+              <w:bottom w:type="dxa" w:w="60"/>
+              <w:right w:type="dxa" w:w="100"/>
+            </w:tcMar>
+          </w:tcPr>
+          <w:p>
+            <w:pPr>
+              <w:spacing w:after="0" w:before="0"/>
+            </w:pPr>
+            <w:r>
+              <w:rPr>
+                <w:sz w:val="19"/>
+                <w:szCs w:val="19"/>
+              </w:rPr>
+              <w:t xml:space="preserve">3 October 2026</w:t>
+            </w:r>
+          </w:p>
+        </w:tc>
+        <w:tc>
+          <w:tcPr>
+            <w:tcW w:type="dxa" w:w="3280"/>
+            <w:tcBorders>
+              <w:top w:val="single" w:color="E2E8F0" w:sz="4"/>
+              <w:left w:val="single" w:color="E2E8F0" w:sz="4"/>
+              <w:bottom w:val="single" w:color="E2E8F0" w:sz="4"/>
+              <w:right w:val="single" w:color="E2E8F0" w:sz="4"/>
+            </w:tcBorders>
+            <w:tcMar>
+              <w:top w:type="dxa" w:w="60"/>
+              <w:left w:type="dxa" w:w="100"/>
+              <w:bottom w:type="dxa" w:w="60"/>
+              <w:right w:type="dxa" w:w="100"/>
+            </w:tcMar>
+          </w:tcPr>
+          <w:p>
+            <w:pPr>
+              <w:spacing w:after="0" w:before="0"/>
+            </w:pPr>
+            <w:r>
+              <w:rPr>
+                <w:sz w:val="19"/>
+                <w:szCs w:val="19"/>
+              </w:rPr>
+              <w:t xml:space="preserve">Web team requests: </w:t>
+            </w:r>
+            <w:r>
+              <w:rPr>
+                <w:rFonts w:ascii="Consolas" w:cs="Consolas" w:eastAsia="Consolas" w:hAnsi="Consolas"/>
+                <w:sz w:val="18"/>
+                <w:szCs w:val="18"/>
+                <w:shd w:fill="F1F5F9" w:color="auto" w:val="clear"/>
+              </w:rPr>
+              <w:t xml:space="preserve">header-36</w:t>
+            </w:r>
+            <w:r>
+              <w:rPr>
+                <w:sz w:val="19"/>
+                <w:szCs w:val="19"/>
+              </w:rPr>
+              <w:t xml:space="preserve"> capped at 180px and </w:t>
+            </w:r>
+            <w:r>
+              <w:rPr>
+                <w:rFonts w:ascii="Consolas" w:cs="Consolas" w:eastAsia="Consolas" w:hAnsi="Consolas"/>
+                <w:sz w:val="18"/>
+                <w:szCs w:val="18"/>
+                <w:shd w:fill="F1F5F9" w:color="auto" w:val="clear"/>
+              </w:rPr>
+              <w:t xml:space="preserve">header-28</w:t>
+            </w:r>
+            <w:r>
+              <w:rPr>
+                <w:sz w:val="19"/>
+                <w:szCs w:val="19"/>
+              </w:rPr>
+              <w:t xml:space="preserve"> at 140px wide; added </w:t>
+            </w:r>
+            <w:r>
+              <w:rPr>
+                <w:rFonts w:ascii="Consolas" w:cs="Consolas" w:eastAsia="Consolas" w:hAnsi="Consolas"/>
+                <w:sz w:val="18"/>
+                <w:szCs w:val="18"/>
+                <w:shd w:fill="F1F5F9" w:color="auto" w:val="clear"/>
+              </w:rPr>
+              <w:t xml:space="preserve">header-42</w:t>
+            </w:r>
+            <w:r>
+              <w:rPr>
+                <w:sz w:val="19"/>
+                <w:szCs w:val="19"/>
+              </w:rPr>
+              <w:t xml:space="preserve"> (email, 212 × 42) and </w:t>
+            </w:r>
+            <w:r>
+              <w:rPr>
+                <w:rFonts w:ascii="Consolas" w:cs="Consolas" w:eastAsia="Consolas" w:hAnsi="Consolas"/>
+                <w:sz w:val="18"/>
+                <w:szCs w:val="18"/>
+                <w:shd w:fill="F1F5F9" w:color="auto" w:val="clear"/>
+              </w:rPr>
+              <w:t xml:space="preserve">header-48</w:t>
+            </w:r>
+            <w:r>
+              <w:rPr>
+                <w:sz w:val="19"/>
+                <w:szCs w:val="19"/>
+              </w:rPr>
+              <w:t xml:space="preserve"> (login page). Phones 360–639px use </w:t>
+            </w:r>
+            <w:r>
+              <w:rPr>
+                <w:rFonts w:ascii="Consolas" w:cs="Consolas" w:eastAsia="Consolas" w:hAnsi="Consolas"/>
+                <w:sz w:val="18"/>
+                <w:szCs w:val="18"/>
+                <w:shd w:fill="F1F5F9" w:color="auto" w:val="clear"/>
+              </w:rPr>
+              <w:t xml:space="preserve">header-36</w:t>
+            </w:r>
+            <w:r>
+              <w:rPr>
+                <w:sz w:val="19"/>
+                <w:szCs w:val="19"/>
+              </w:rPr>
+              <w:t xml:space="preserve">, 320–359px use </w:t>
+            </w:r>
+            <w:r>
+              <w:rPr>
+                <w:rFonts w:ascii="Consolas" w:cs="Consolas" w:eastAsia="Consolas" w:hAnsi="Consolas"/>
+                <w:sz w:val="18"/>
+                <w:szCs w:val="18"/>
+                <w:shd w:fill="F1F5F9" w:color="auto" w:val="clear"/>
+              </w:rPr>
+              <w:t xml:space="preserve">header-28</w:t>
+            </w:r>
+            <w:r>
+              <w:rPr>
+                <w:sz w:val="19"/>
+                <w:szCs w:val="19"/>
+              </w:rPr>
+              <w:t xml:space="preserve">.</w:t>
             </w:r>
           </w:p>
         </w:tc>
@@ -22983,7 +24054,7 @@
         <w:sz w:val="16"/>
         <w:szCs w:val="16"/>
       </w:rPr>
-      <w:t xml:space="preserve">resale.com.pk · Brand and UI guidelines · v1.2</w:t>
+      <w:t xml:space="preserve">resale.com.pk · Brand and UI guidelines · v1.3</w:t>
     </w:r>
   </w:p>
 </w:hdr>

</xml_diff>